<commit_message>
Add OpenReview profile link to sidebar card
OpenReview has no official vector icon in Font Awesome / Academicons /
Simple Icons, so the entry uses a small inline SVG badge (brand-red
rounded square with a white OR monogram). The profile URL is read from
the new openreview field in profile.yml / profile_zh.yml.

Co-Authored-By: Claude <noreply@anthropic.com>
</commit_message>
<xml_diff>
--- a/file/CV_CN_all.docx
+++ b/file/CV_CN_all.docx
@@ -1,6 +1,6 @@
 
 <file path=word/document.xml><?xml version="1.0" encoding="utf-8"?>
-<w:document xmlns:wpc="http://schemas.microsoft.com/office/word/2010/wordprocessingCanvas" xmlns:mc="http://schemas.openxmlformats.org/markup-compatibility/2006" xmlns:o="urn:schemas-microsoft-com:office:office" xmlns:r="http://schemas.openxmlformats.org/officeDocument/2006/relationships" xmlns:m="http://schemas.openxmlformats.org/officeDocument/2006/math" xmlns:v="urn:schemas-microsoft-com:vml" xmlns:wp14="http://schemas.microsoft.com/office/word/2010/wordprocessingDrawing" xmlns:wp="http://schemas.openxmlformats.org/drawingml/2006/wordprocessingDrawing" xmlns:w="http://schemas.openxmlformats.org/wordprocessingml/2006/main" xmlns:w14="http://schemas.microsoft.com/office/word/2010/wordml" xmlns:w10="urn:schemas-microsoft-com:office:word" xmlns:w15="http://schemas.microsoft.com/office/word/2012/wordml" xmlns:wpg="http://schemas.microsoft.com/office/word/2010/wordprocessingGroup" xmlns:wpi="http://schemas.microsoft.com/office/word/2010/wordprocessingInk" xmlns:wne="http://schemas.microsoft.com/office/word/2006/wordml" xmlns:wps="http://schemas.microsoft.com/office/word/2010/wordprocessingShape" xmlns:wpsCustomData="http://www.wps.cn/officeDocument/2013/wpsCustomData" mc:Ignorable="w14 w15 wp14">
+<w:document xmlns:wpc="http://schemas.microsoft.com/office/word/2010/wordprocessingCanvas" xmlns:cx="http://schemas.microsoft.com/office/drawing/2014/chartex" xmlns:cx1="http://schemas.microsoft.com/office/drawing/2015/9/8/chartex" xmlns:cx2="http://schemas.microsoft.com/office/drawing/2015/10/21/chartex" xmlns:cx3="http://schemas.microsoft.com/office/drawing/2016/5/9/chartex" xmlns:cx4="http://schemas.microsoft.com/office/drawing/2016/5/10/chartex" xmlns:cx5="http://schemas.microsoft.com/office/drawing/2016/5/11/chartex" xmlns:cx6="http://schemas.microsoft.com/office/drawing/2016/5/12/chartex" xmlns:cx7="http://schemas.microsoft.com/office/drawing/2016/5/13/chartex" xmlns:cx8="http://schemas.microsoft.com/office/drawing/2016/5/14/chartex" xmlns:mc="http://schemas.openxmlformats.org/markup-compatibility/2006" xmlns:o="urn:schemas-microsoft-com:office:office" xmlns:r="http://schemas.openxmlformats.org/officeDocument/2006/relationships" xmlns:m="http://schemas.openxmlformats.org/officeDocument/2006/math" xmlns:v="urn:schemas-microsoft-com:vml" xmlns:wp14="http://schemas.microsoft.com/office/word/2010/wordprocessingDrawing" xmlns:wp="http://schemas.openxmlformats.org/drawingml/2006/wordprocessingDrawing" xmlns:w="http://schemas.openxmlformats.org/wordprocessingml/2006/main" xmlns:w14="http://schemas.microsoft.com/office/word/2010/wordml" xmlns:w10="urn:schemas-microsoft-com:office:word" xmlns:w15="http://schemas.microsoft.com/office/word/2012/wordml" xmlns:wpg="http://schemas.microsoft.com/office/word/2010/wordprocessingGroup" xmlns:wpi="http://schemas.microsoft.com/office/word/2010/wordprocessingInk" xmlns:wne="http://schemas.microsoft.com/office/word/2006/wordml" xmlns:wps="http://schemas.microsoft.com/office/word/2010/wordprocessingShape" xmlns:wpsCustomData="http://www.wps.cn/officeDocument/2013/wpsCustomData" mc:Ignorable="w14 w15 wp14">
   <w:body>
     <w:p>
       <w:pPr>
@@ -593,6 +593,9 @@
         <w:widowControl w:val="0"/>
         <w:tabs>
           <w:tab w:val="left" w:pos="4122"/>
+          <w:tab w:val="left" w:pos="6600"/>
+          <w:tab w:val="left" w:pos="8800"/>
+          <w:tab w:val="left" w:pos="9240"/>
           <w:tab w:val="left" w:pos="9709"/>
         </w:tabs>
         <w:kinsoku/>
@@ -606,14 +609,210 @@
         <w:snapToGrid/>
         <w:spacing w:before="50" w:after="50" w:line="240" w:lineRule="auto"/>
         <w:ind w:left="102" w:right="113"/>
+        <w:jc w:val="both"/>
         <w:textAlignment w:val="auto"/>
         <w:rPr>
+          <w:rFonts w:hint="eastAsia" w:ascii="Times New Roman" w:hAnsi="Times New Roman" w:eastAsia="楷体"/>
+          <w:b/>
+          <w:color w:val="auto"/>
+          <w:spacing w:val="-9"/>
+          <w:sz w:val="21"/>
+          <w:szCs w:val="21"/>
+          <w:u w:val="none"/>
+          <w:vertAlign w:val="baseline"/>
+          <w:lang w:val="en-US" w:eastAsia="zh-CN"/>
+        </w:rPr>
+      </w:pPr>
+      <w:r>
+        <w:rPr>
+          <w:rFonts w:hint="eastAsia" w:ascii="楷体" w:hAnsi="楷体" w:eastAsia="楷体" w:cs="楷体"/>
+          <w:b/>
+          <w:bCs/>
+          <w:color w:val="auto"/>
+          <w:spacing w:val="-3"/>
+          <w:kern w:val="4"/>
+          <w:sz w:val="21"/>
+          <w:szCs w:val="21"/>
+          <w:u w:val="none"/>
+          <w:vertAlign w:val="baseline"/>
+          <w:lang w:val="en-US" w:eastAsia="zh-CN" w:bidi="ar-SA"/>
+        </w:rPr>
+        <w:t>东北大学（985） | 计算机科学与工程学院 | 通信工程</w:t>
+      </w:r>
+      <w:r>
+        <w:rPr>
+          <w:rFonts w:hint="eastAsia" w:ascii="楷体" w:hAnsi="楷体" w:eastAsia="楷体" w:cs="楷体"/>
+          <w:b/>
+          <w:bCs/>
+          <w:color w:val="auto"/>
+          <w:spacing w:val="-3"/>
+          <w:kern w:val="4"/>
+          <w:sz w:val="21"/>
+          <w:szCs w:val="21"/>
+          <w:u w:val="none"/>
+          <w:vertAlign w:val="baseline"/>
+          <w:lang w:val="en-US" w:eastAsia="zh-CN" w:bidi="ar-SA"/>
+        </w:rPr>
+        <w:tab/>
+        <w:t>本科生</w:t>
+      </w:r>
+      <w:r>
+        <w:rPr>
+          <w:rFonts w:hint="eastAsia" w:ascii="楷体" w:hAnsi="楷体" w:eastAsia="楷体" w:cs="楷体"/>
+          <w:b/>
+          <w:bCs/>
+          <w:color w:val="auto"/>
+          <w:spacing w:val="-3"/>
+          <w:kern w:val="4"/>
+          <w:sz w:val="21"/>
+          <w:szCs w:val="21"/>
+          <w:u w:val="none"/>
+          <w:vertAlign w:val="baseline"/>
+          <w:lang w:val="en-US" w:eastAsia="zh-CN" w:bidi="ar-SA"/>
+        </w:rPr>
+        <w:tab/>
+      </w:r>
+      <w:r>
+        <w:rPr>
+          <w:rFonts w:ascii="Times New Roman" w:hAnsi="Times New Roman" w:eastAsia="楷体"/>
+          <w:b/>
+          <w:color w:val="auto"/>
+          <w:sz w:val="21"/>
+          <w:szCs w:val="21"/>
+          <w:u w:val="none"/>
+          <w:vertAlign w:val="baseline"/>
+          <w:lang w:eastAsia="zh-CN"/>
+        </w:rPr>
+        <w:t>202</w:t>
+      </w:r>
+      <w:r>
+        <w:rPr>
+          <w:rFonts w:hint="eastAsia" w:ascii="Times New Roman" w:hAnsi="Times New Roman" w:eastAsia="楷体"/>
+          <w:b/>
+          <w:color w:val="auto"/>
+          <w:sz w:val="21"/>
+          <w:szCs w:val="21"/>
+          <w:u w:val="none"/>
+          <w:vertAlign w:val="baseline"/>
+          <w:lang w:val="en-US" w:eastAsia="zh-CN"/>
+        </w:rPr>
+        <w:t>3</w:t>
+      </w:r>
+      <w:r>
+        <w:rPr>
+          <w:rFonts w:hint="eastAsia" w:ascii="Times New Roman" w:hAnsi="Times New Roman" w:eastAsia="楷体"/>
+          <w:b/>
+          <w:color w:val="auto"/>
+          <w:sz w:val="21"/>
+          <w:szCs w:val="21"/>
+          <w:u w:val="none"/>
+          <w:vertAlign w:val="baseline"/>
+          <w:lang w:eastAsia="zh-CN"/>
+        </w:rPr>
+        <w:t>.</w:t>
+      </w:r>
+      <w:r>
+        <w:rPr>
+          <w:rFonts w:ascii="Times New Roman" w:hAnsi="Times New Roman" w:eastAsia="楷体"/>
+          <w:b/>
+          <w:color w:val="auto"/>
+          <w:sz w:val="21"/>
+          <w:szCs w:val="21"/>
+          <w:u w:val="none"/>
+          <w:vertAlign w:val="baseline"/>
+          <w:lang w:eastAsia="zh-CN"/>
+        </w:rPr>
+        <w:t>09</w:t>
+      </w:r>
+      <w:r>
+        <w:rPr>
+          <w:rFonts w:hint="eastAsia" w:ascii="Times New Roman" w:hAnsi="Times New Roman" w:eastAsia="楷体"/>
+          <w:b/>
+          <w:color w:val="auto"/>
+          <w:sz w:val="21"/>
+          <w:szCs w:val="21"/>
+          <w:u w:val="none"/>
+          <w:vertAlign w:val="baseline"/>
+          <w:lang w:val="en-US" w:eastAsia="zh-CN"/>
+        </w:rPr>
+        <w:t xml:space="preserve"> </w:t>
+      </w:r>
+      <w:r>
+        <w:rPr>
+          <w:rFonts w:hint="eastAsia" w:ascii="Times New Roman" w:hAnsi="Times New Roman" w:eastAsia="楷体"/>
+          <w:b/>
+          <w:color w:val="auto"/>
+          <w:sz w:val="21"/>
+          <w:szCs w:val="21"/>
+          <w:u w:val="none"/>
+          <w:vertAlign w:val="baseline"/>
+          <w:lang w:eastAsia="zh-CN"/>
+        </w:rPr>
+        <w:t>—</w:t>
+      </w:r>
+      <w:r>
+        <w:rPr>
+          <w:rFonts w:hint="eastAsia" w:ascii="Times New Roman" w:hAnsi="Times New Roman" w:eastAsia="楷体"/>
+          <w:b/>
+          <w:color w:val="auto"/>
+          <w:sz w:val="21"/>
+          <w:szCs w:val="21"/>
+          <w:u w:val="none"/>
+          <w:vertAlign w:val="baseline"/>
+          <w:lang w:val="en-US" w:eastAsia="zh-CN"/>
+        </w:rPr>
+        <w:t xml:space="preserve"> </w:t>
+      </w:r>
+      <w:r>
+        <w:rPr>
+          <w:rFonts w:hint="eastAsia" w:ascii="Times New Roman" w:hAnsi="Times New Roman" w:eastAsia="楷体"/>
+          <w:b/>
+          <w:color w:val="auto"/>
+          <w:spacing w:val="-9"/>
+          <w:sz w:val="21"/>
+          <w:szCs w:val="21"/>
+          <w:u w:val="none"/>
+          <w:vertAlign w:val="baseline"/>
+          <w:lang w:val="en-US" w:eastAsia="zh-CN"/>
+        </w:rPr>
+        <w:t>至今</w:t>
+      </w:r>
+    </w:p>
+    <w:p>
+      <w:pPr>
+        <w:keepNext w:val="0"/>
+        <w:keepLines w:val="0"/>
+        <w:pageBreakBefore w:val="0"/>
+        <w:widowControl w:val="0"/>
+        <w:tabs>
+          <w:tab w:val="left" w:pos="4122"/>
+          <w:tab w:val="left" w:pos="6600"/>
+          <w:tab w:val="left" w:pos="8800"/>
+          <w:tab w:val="left" w:pos="9240"/>
+          <w:tab w:val="left" w:pos="9709"/>
+        </w:tabs>
+        <w:kinsoku/>
+        <w:wordWrap/>
+        <w:overflowPunct/>
+        <w:topLinePunct w:val="0"/>
+        <w:autoSpaceDE w:val="0"/>
+        <w:autoSpaceDN w:val="0"/>
+        <w:bidi w:val="0"/>
+        <w:adjustRightInd/>
+        <w:snapToGrid/>
+        <w:spacing w:before="50" w:after="50" w:line="240" w:lineRule="auto"/>
+        <w:ind w:left="102" w:right="113"/>
+        <w:jc w:val="both"/>
+        <w:textAlignment w:val="auto"/>
+        <w:rPr>
           <w:rFonts w:hint="default" w:ascii="Times New Roman" w:hAnsi="Times New Roman" w:eastAsia="楷体"/>
           <w:b/>
           <w:color w:val="auto"/>
-          <w:spacing w:val="-17"/>
-          <w:sz w:val="21"/>
-          <w:szCs w:val="21"/>
+          <w:spacing w:val="-9"/>
+          <w:sz w:val="21"/>
+          <w:szCs w:val="21"/>
+          <w:u w:val="none"/>
+          <w:vertAlign w:val="baseline"/>
           <w:lang w:val="en-US" w:eastAsia="zh-CN"/>
         </w:rPr>
       </w:pPr>
@@ -627,9 +826,44 @@
           <w:kern w:val="4"/>
           <w:sz w:val="21"/>
           <w:szCs w:val="21"/>
-          <w:lang w:val="en-US" w:eastAsia="zh-CN" w:bidi="ar-SA"/>
-        </w:rPr>
-        <w:t>东北大学（985） | 计算机科学与工程学院 | 通信工程</w:t>
+          <w:u w:val="none"/>
+          <w:vertAlign w:val="baseline"/>
+          <w:lang w:val="en-US" w:eastAsia="zh-CN" w:bidi="ar-SA"/>
+        </w:rPr>
+        <w:t>浙江大学（985） |     人工智能学院     | 人工智能</w:t>
+      </w:r>
+      <w:r>
+        <w:rPr>
+          <w:rFonts w:hint="eastAsia" w:ascii="楷体" w:hAnsi="楷体" w:eastAsia="楷体" w:cs="楷体"/>
+          <w:b/>
+          <w:bCs/>
+          <w:color w:val="auto"/>
+          <w:spacing w:val="-3"/>
+          <w:kern w:val="4"/>
+          <w:sz w:val="21"/>
+          <w:szCs w:val="21"/>
+          <w:u w:val="none"/>
+          <w:vertAlign w:val="baseline"/>
+          <w:lang w:val="en-US" w:eastAsia="zh-CN" w:bidi="ar-SA"/>
+        </w:rPr>
+        <w:tab/>
+        <w:t>博士研究生</w:t>
+      </w:r>
+      <w:r>
+        <w:rPr>
+          <w:rFonts w:hint="eastAsia" w:ascii="楷体" w:hAnsi="楷体" w:eastAsia="楷体" w:cs="楷体"/>
+          <w:b/>
+          <w:bCs/>
+          <w:color w:val="auto"/>
+          <w:spacing w:val="-3"/>
+          <w:kern w:val="4"/>
+          <w:sz w:val="21"/>
+          <w:szCs w:val="21"/>
+          <w:u w:val="none"/>
+          <w:vertAlign w:val="baseline"/>
+          <w:lang w:val="en-US" w:eastAsia="zh-CN" w:bidi="ar-SA"/>
+        </w:rPr>
+        <w:tab/>
       </w:r>
       <w:r>
         <w:rPr>
@@ -638,9 +872,37 @@
           <w:color w:val="auto"/>
           <w:sz w:val="21"/>
           <w:szCs w:val="21"/>
+          <w:u w:val="none"/>
+          <w:vertAlign w:val="baseline"/>
           <w:lang w:eastAsia="zh-CN"/>
         </w:rPr>
-        <w:tab/>
+        <w:t>202</w:t>
+      </w:r>
+      <w:r>
+        <w:rPr>
+          <w:rFonts w:hint="eastAsia" w:ascii="Times New Roman" w:hAnsi="Times New Roman" w:eastAsia="楷体"/>
+          <w:b/>
+          <w:color w:val="auto"/>
+          <w:sz w:val="21"/>
+          <w:szCs w:val="21"/>
+          <w:u w:val="none"/>
+          <w:vertAlign w:val="baseline"/>
+          <w:lang w:val="en-US" w:eastAsia="zh-CN"/>
+        </w:rPr>
+        <w:t>7</w:t>
+      </w:r>
+      <w:r>
+        <w:rPr>
+          <w:rFonts w:hint="eastAsia" w:ascii="Times New Roman" w:hAnsi="Times New Roman" w:eastAsia="楷体"/>
+          <w:b/>
+          <w:color w:val="auto"/>
+          <w:sz w:val="21"/>
+          <w:szCs w:val="21"/>
+          <w:u w:val="none"/>
+          <w:vertAlign w:val="baseline"/>
+          <w:lang w:eastAsia="zh-CN"/>
+        </w:rPr>
+        <w:t>.</w:t>
       </w:r>
       <w:r>
         <w:rPr>
@@ -649,9 +911,11 @@
           <w:color w:val="auto"/>
           <w:sz w:val="21"/>
           <w:szCs w:val="21"/>
+          <w:u w:val="none"/>
+          <w:vertAlign w:val="baseline"/>
           <w:lang w:eastAsia="zh-CN"/>
         </w:rPr>
-        <w:t>202</w:t>
+        <w:t>09</w:t>
       </w:r>
       <w:r>
         <w:rPr>
@@ -660,9 +924,11 @@
           <w:color w:val="auto"/>
           <w:sz w:val="21"/>
           <w:szCs w:val="21"/>
-          <w:lang w:val="en-US" w:eastAsia="zh-CN"/>
-        </w:rPr>
-        <w:t>3</w:t>
+          <w:u w:val="none"/>
+          <w:vertAlign w:val="baseline"/>
+          <w:lang w:val="en-US" w:eastAsia="zh-CN"/>
+        </w:rPr>
+        <w:t xml:space="preserve"> </w:t>
       </w:r>
       <w:r>
         <w:rPr>
@@ -671,20 +937,11 @@
           <w:color w:val="auto"/>
           <w:sz w:val="21"/>
           <w:szCs w:val="21"/>
+          <w:u w:val="none"/>
+          <w:vertAlign w:val="baseline"/>
           <w:lang w:eastAsia="zh-CN"/>
         </w:rPr>
-        <w:t>.</w:t>
-      </w:r>
-      <w:r>
-        <w:rPr>
-          <w:rFonts w:ascii="Times New Roman" w:hAnsi="Times New Roman" w:eastAsia="楷体"/>
-          <w:b/>
-          <w:color w:val="auto"/>
-          <w:sz w:val="21"/>
-          <w:szCs w:val="21"/>
-          <w:lang w:eastAsia="zh-CN"/>
-        </w:rPr>
-        <w:t>09</w:t>
+        <w:t>—</w:t>
       </w:r>
       <w:r>
         <w:rPr>
@@ -693,43 +950,25 @@
           <w:color w:val="auto"/>
           <w:sz w:val="21"/>
           <w:szCs w:val="21"/>
-          <w:lang w:val="en-US" w:eastAsia="zh-CN"/>
-        </w:rPr>
-        <w:t xml:space="preserve"> </w:t>
+          <w:u w:val="none"/>
+          <w:vertAlign w:val="baseline"/>
+          <w:lang w:val="en-US" w:eastAsia="zh-CN"/>
+        </w:rPr>
+        <w:t xml:space="preserve"> 2</w:t>
       </w:r>
       <w:r>
         <w:rPr>
           <w:rFonts w:hint="eastAsia" w:ascii="Times New Roman" w:hAnsi="Times New Roman" w:eastAsia="楷体"/>
           <w:b/>
           <w:color w:val="auto"/>
-          <w:sz w:val="21"/>
-          <w:szCs w:val="21"/>
-          <w:lang w:eastAsia="zh-CN"/>
-        </w:rPr>
-        <w:t>—</w:t>
-      </w:r>
-      <w:r>
-        <w:rPr>
-          <w:rFonts w:hint="eastAsia" w:ascii="Times New Roman" w:hAnsi="Times New Roman" w:eastAsia="楷体"/>
-          <w:b/>
-          <w:color w:val="auto"/>
-          <w:sz w:val="21"/>
-          <w:szCs w:val="21"/>
-          <w:lang w:val="en-US" w:eastAsia="zh-CN"/>
-        </w:rPr>
-        <w:t xml:space="preserve"> </w:t>
-      </w:r>
-      <w:r>
-        <w:rPr>
-          <w:rFonts w:hint="eastAsia" w:ascii="Times New Roman" w:hAnsi="Times New Roman" w:eastAsia="楷体"/>
-          <w:b/>
-          <w:color w:val="auto"/>
           <w:spacing w:val="-9"/>
           <w:sz w:val="21"/>
           <w:szCs w:val="21"/>
-          <w:lang w:val="en-US" w:eastAsia="zh-CN"/>
-        </w:rPr>
-        <w:t>至今</w:t>
+          <w:u w:val="none"/>
+          <w:vertAlign w:val="baseline"/>
+          <w:lang w:val="en-US" w:eastAsia="zh-CN"/>
+        </w:rPr>
+        <w:t>032.06（预计）</w:t>
       </w:r>
     </w:p>
     <w:p>
@@ -837,35 +1076,21 @@
           <w:szCs w:val="21"/>
           <w:lang w:val="en-US" w:eastAsia="zh-CN" w:bidi="ar-SA"/>
         </w:rPr>
-        <w:t>专业排名：</w:t>
-      </w:r>
-      <w:r>
-        <w:rPr>
-          <w:rFonts w:hint="eastAsia" w:ascii="楷体" w:hAnsi="楷体" w:eastAsia="楷体" w:cs="楷体"/>
-          <w:b w:val="0"/>
-          <w:bCs w:val="0"/>
-          <w:color w:val="auto"/>
-          <w:spacing w:val="-3"/>
-          <w:kern w:val="4"/>
-          <w:sz w:val="21"/>
-          <w:szCs w:val="21"/>
-          <w:lang w:val="en-US" w:eastAsia="zh-CN" w:bidi="ar-SA"/>
-        </w:rPr>
-        <w:t>4</w:t>
-      </w:r>
-      <w:r>
-        <w:rPr>
-          <w:rFonts w:hint="eastAsia" w:ascii="Times New Roman" w:hAnsi="Times New Roman" w:eastAsia="楷体" w:cs="Times New Roman"/>
-          <w:b w:val="0"/>
-          <w:bCs w:val="0"/>
-          <w:color w:val="auto"/>
-          <w:spacing w:val="-3"/>
-          <w:kern w:val="4"/>
-          <w:sz w:val="21"/>
-          <w:szCs w:val="21"/>
-          <w:lang w:val="en-US" w:eastAsia="zh-CN" w:bidi="ar-SA"/>
-        </w:rPr>
-        <w:t xml:space="preserve"> / 87  (4.60%)</w:t>
+        <w:t>专业排名：3</w:t>
+      </w:r>
+      <w:r>
+        <w:rPr>
+          <w:rFonts w:hint="eastAsia" w:ascii="Times New Roman" w:hAnsi="Times New Roman" w:eastAsia="楷体" w:cs="Times New Roman"/>
+          <w:b w:val="0"/>
+          <w:bCs w:val="0"/>
+          <w:color w:val="auto"/>
+          <w:spacing w:val="-3"/>
+          <w:kern w:val="4"/>
+          <w:sz w:val="21"/>
+          <w:szCs w:val="21"/>
+          <w:lang w:val="en-US" w:eastAsia="zh-CN" w:bidi="ar-SA"/>
+        </w:rPr>
+        <w:t xml:space="preserve"> / 90  (3.33%)</w:t>
       </w:r>
       <w:r>
         <w:rPr>
@@ -1212,8 +1437,6 @@
         </w:rPr>
         <w:t>等。</w:t>
       </w:r>
-      <w:bookmarkStart w:id="2" w:name="_GoBack"/>
-      <w:bookmarkEnd w:id="2"/>
     </w:p>
     <w:p>
       <w:pPr>
@@ -1350,7 +1573,7 @@
           <w:tab w:val="left" w:pos="3740"/>
           <w:tab w:val="left" w:pos="5500"/>
           <w:tab w:val="left" w:pos="5940"/>
-          <w:tab w:val="left" w:pos="7920"/>
+          <w:tab w:val="left" w:pos="7700"/>
         </w:tabs>
         <w:kinsoku/>
         <w:wordWrap/>
@@ -1388,7 +1611,7 @@
           <w:szCs w:val="21"/>
           <w:lang w:val="en-US" w:eastAsia="zh-CN"/>
         </w:rPr>
-        <w:t>2025.12-2026.04</w:t>
+        <w:t>2025.12-2026.09</w:t>
       </w:r>
       <w:r>
         <w:rPr>
@@ -1430,7 +1653,35 @@
           <w:szCs w:val="21"/>
           <w:lang w:val="en-US" w:eastAsia="zh-CN"/>
         </w:rPr>
-        <w:t xml:space="preserve">深度学习模型量化与推理加速算法研究与工程实践       </w:t>
+        <w:t xml:space="preserve">面向 </w:t>
+      </w:r>
+      <w:r>
+        <w:rPr>
+          <w:rFonts w:hint="eastAsia" w:ascii="Times New Roman" w:hAnsi="Times New Roman" w:eastAsia="楷体" w:cs="Times New Roman"/>
+          <w:b/>
+          <w:bCs/>
+          <w:color w:val="auto"/>
+          <w:spacing w:val="-3"/>
+          <w:kern w:val="4"/>
+          <w:sz w:val="21"/>
+          <w:szCs w:val="21"/>
+          <w:lang w:val="en-US" w:eastAsia="zh-CN" w:bidi="ar-SA"/>
+        </w:rPr>
+        <w:t xml:space="preserve">VLA-Agents </w:t>
+      </w:r>
+      <w:r>
+        <w:rPr>
+          <w:rFonts w:hint="eastAsia" w:ascii="楷体" w:hAnsi="楷体" w:eastAsia="楷体" w:cs="楷体"/>
+          <w:b/>
+          <w:bCs/>
+          <w:color w:val="auto"/>
+          <w:spacing w:val="-3"/>
+          <w:kern w:val="4"/>
+          <w:sz w:val="21"/>
+          <w:szCs w:val="21"/>
+          <w:lang w:val="en-US" w:eastAsia="zh-CN"/>
+        </w:rPr>
+        <w:t xml:space="preserve">的组合式能量扩散策略研究       </w:t>
       </w:r>
       <w:r>
         <w:rPr>
@@ -1459,48 +1710,7 @@
           <w:lang w:val="en-US" w:eastAsia="zh-CN"/>
         </w:rPr>
         <w:tab/>
-      </w:r>
-      <w:r>
-        <w:rPr>
-          <w:rFonts w:hint="eastAsia" w:ascii="楷体" w:hAnsi="楷体" w:eastAsia="楷体" w:cs="楷体"/>
-          <w:b/>
-          <w:bCs/>
-          <w:color w:val="auto"/>
-          <w:spacing w:val="-3"/>
-          <w:kern w:val="4"/>
-          <w:sz w:val="21"/>
-          <w:szCs w:val="21"/>
-          <w:lang w:val="en-US" w:eastAsia="zh-CN"/>
-        </w:rPr>
-        <w:tab/>
-      </w:r>
-      <w:r>
-        <w:rPr>
-          <w:rFonts w:hint="eastAsia" w:ascii="楷体" w:hAnsi="楷体" w:eastAsia="楷体" w:cs="楷体"/>
-          <w:b/>
-          <w:bCs/>
-          <w:color w:val="auto"/>
-          <w:spacing w:val="-3"/>
-          <w:kern w:val="4"/>
-          <w:sz w:val="21"/>
-          <w:szCs w:val="21"/>
-          <w:lang w:val="en-US" w:eastAsia="zh-CN"/>
-        </w:rPr>
-        <w:tab/>
-      </w:r>
-      <w:r>
-        <w:rPr>
-          <w:rFonts w:hint="eastAsia" w:ascii="楷体" w:hAnsi="楷体" w:eastAsia="楷体" w:cs="楷体"/>
-          <w:b/>
-          <w:bCs/>
-          <w:color w:val="auto"/>
-          <w:spacing w:val="-3"/>
-          <w:kern w:val="4"/>
-          <w:sz w:val="21"/>
-          <w:szCs w:val="21"/>
-          <w:lang w:val="en-US" w:eastAsia="zh-CN"/>
-        </w:rPr>
-        <w:t>科研实习</w:t>
+        <w:t>王文冠老师课题组科研实习</w:t>
       </w:r>
     </w:p>
     <w:p>
@@ -1535,476 +1745,474 @@
         <w:ind w:left="198" w:leftChars="0"/>
         <w:textAlignment w:val="auto"/>
         <w:rPr>
-          <w:rFonts w:hint="eastAsia" w:ascii="楷体" w:hAnsi="楷体" w:eastAsia="楷体" w:cs="楷体"/>
-          <w:color w:val="auto"/>
-          <w:spacing w:val="-3"/>
-          <w:kern w:val="4"/>
-          <w:sz w:val="21"/>
-          <w:szCs w:val="21"/>
+          <w:rFonts w:hint="default" w:ascii="楷体" w:hAnsi="楷体" w:eastAsia="楷体" w:cs="楷体"/>
+          <w:b/>
+          <w:bCs/>
+          <w:color w:val="auto"/>
+          <w:spacing w:val="-3"/>
+          <w:kern w:val="4"/>
+          <w:sz w:val="21"/>
+          <w:szCs w:val="21"/>
+          <w:u w:val="single"/>
           <w:lang w:val="en-US" w:eastAsia="zh-CN"/>
         </w:rPr>
       </w:pPr>
       <w:r>
         <w:rPr>
           <w:rFonts w:hint="eastAsia" w:ascii="楷体" w:hAnsi="楷体" w:eastAsia="楷体" w:cs="楷体"/>
-          <w:color w:val="auto"/>
-          <w:spacing w:val="-3"/>
-          <w:kern w:val="4"/>
-          <w:sz w:val="21"/>
-          <w:szCs w:val="21"/>
-          <w:lang w:val="en-US" w:eastAsia="zh-CN"/>
-        </w:rPr>
-        <w:t xml:space="preserve">系统学习 </w:t>
-      </w:r>
-      <w:r>
-        <w:rPr>
-          <w:rFonts w:hint="eastAsia" w:ascii="Times New Roman" w:hAnsi="Times New Roman" w:eastAsia="楷体" w:cs="Times New Roman"/>
-          <w:b/>
-          <w:bCs/>
-          <w:color w:val="auto"/>
-          <w:spacing w:val="-3"/>
-          <w:kern w:val="4"/>
-          <w:sz w:val="21"/>
-          <w:szCs w:val="21"/>
-          <w:lang w:val="en-US" w:eastAsia="zh-CN"/>
-        </w:rPr>
-        <w:t>Torch、TensorRT</w:t>
-      </w:r>
-      <w:r>
-        <w:rPr>
-          <w:rFonts w:hint="eastAsia" w:ascii="楷体" w:hAnsi="楷体" w:eastAsia="楷体" w:cs="楷体"/>
-          <w:b/>
-          <w:bCs/>
-          <w:color w:val="auto"/>
-          <w:spacing w:val="-3"/>
-          <w:kern w:val="4"/>
-          <w:sz w:val="21"/>
-          <w:szCs w:val="21"/>
-          <w:lang w:val="en-US" w:eastAsia="zh-CN"/>
-        </w:rPr>
-        <w:t xml:space="preserve"> 量化底层技术</w:t>
-      </w:r>
-      <w:r>
-        <w:rPr>
-          <w:rFonts w:hint="eastAsia" w:ascii="楷体" w:hAnsi="楷体" w:eastAsia="楷体" w:cs="楷体"/>
-          <w:color w:val="auto"/>
-          <w:spacing w:val="-3"/>
-          <w:kern w:val="4"/>
-          <w:sz w:val="21"/>
-          <w:szCs w:val="21"/>
-          <w:lang w:val="en-US" w:eastAsia="zh-CN"/>
-        </w:rPr>
-        <w:t>，</w:t>
-      </w:r>
-      <w:r>
-        <w:rPr>
-          <w:rFonts w:hint="eastAsia" w:ascii="楷体" w:hAnsi="楷体" w:eastAsia="楷体" w:cs="楷体"/>
-          <w:b/>
-          <w:bCs/>
-          <w:color w:val="auto"/>
-          <w:spacing w:val="-3"/>
-          <w:kern w:val="4"/>
-          <w:sz w:val="21"/>
-          <w:szCs w:val="21"/>
-          <w:lang w:val="en-US" w:eastAsia="zh-CN"/>
-        </w:rPr>
-        <w:t xml:space="preserve">完整复现 </w:t>
-      </w:r>
-      <w:r>
-        <w:rPr>
-          <w:rFonts w:hint="eastAsia" w:ascii="Times New Roman" w:hAnsi="Times New Roman" w:eastAsia="楷体" w:cs="Times New Roman"/>
-          <w:b/>
-          <w:bCs/>
-          <w:color w:val="auto"/>
-          <w:spacing w:val="-3"/>
-          <w:kern w:val="4"/>
-          <w:sz w:val="21"/>
-          <w:szCs w:val="21"/>
-          <w:lang w:val="en-US" w:eastAsia="zh-CN"/>
-        </w:rPr>
-        <w:t>DeepBurst</w:t>
-      </w:r>
-      <w:r>
-        <w:rPr>
-          <w:rFonts w:hint="eastAsia" w:ascii="楷体" w:hAnsi="楷体" w:eastAsia="楷体" w:cs="楷体"/>
-          <w:b/>
-          <w:bCs/>
-          <w:color w:val="auto"/>
-          <w:spacing w:val="-3"/>
-          <w:kern w:val="4"/>
-          <w:sz w:val="21"/>
-          <w:szCs w:val="21"/>
-          <w:lang w:val="en-US" w:eastAsia="zh-CN"/>
-        </w:rPr>
-        <w:t xml:space="preserve"> 量化推理工程</w:t>
-      </w:r>
-      <w:r>
-        <w:rPr>
-          <w:rFonts w:hint="eastAsia" w:ascii="楷体" w:hAnsi="楷体" w:eastAsia="楷体" w:cs="楷体"/>
-          <w:color w:val="auto"/>
-          <w:spacing w:val="-3"/>
-          <w:kern w:val="4"/>
-          <w:sz w:val="21"/>
-          <w:szCs w:val="21"/>
-          <w:lang w:val="en-US" w:eastAsia="zh-CN"/>
-        </w:rPr>
-        <w:t xml:space="preserve">，深入研读 </w:t>
-      </w:r>
-      <w:r>
-        <w:rPr>
-          <w:rFonts w:hint="eastAsia" w:ascii="Times New Roman" w:hAnsi="Times New Roman" w:eastAsia="楷体" w:cs="Times New Roman"/>
-          <w:b w:val="0"/>
-          <w:bCs w:val="0"/>
-          <w:color w:val="auto"/>
-          <w:w w:val="105"/>
-          <w:sz w:val="21"/>
-          <w:szCs w:val="21"/>
-          <w:lang w:val="en-US" w:eastAsia="zh-CN" w:bidi="ar-SA"/>
-        </w:rPr>
-        <w:t>FakeQuant</w:t>
-      </w:r>
-      <w:r>
-        <w:rPr>
-          <w:rFonts w:hint="eastAsia" w:ascii="楷体" w:hAnsi="楷体" w:eastAsia="楷体" w:cs="楷体"/>
-          <w:color w:val="auto"/>
-          <w:spacing w:val="-3"/>
-          <w:kern w:val="4"/>
-          <w:sz w:val="21"/>
-          <w:szCs w:val="21"/>
-          <w:lang w:val="en-US" w:eastAsia="zh-CN"/>
-        </w:rPr>
-        <w:t xml:space="preserve"> 节点、</w:t>
-      </w:r>
-      <w:r>
-        <w:rPr>
-          <w:rFonts w:hint="eastAsia" w:ascii="Times New Roman" w:hAnsi="Times New Roman" w:eastAsia="楷体" w:cs="Times New Roman"/>
-          <w:b w:val="0"/>
-          <w:bCs w:val="0"/>
-          <w:color w:val="auto"/>
-          <w:w w:val="105"/>
-          <w:sz w:val="21"/>
-          <w:szCs w:val="21"/>
-          <w:lang w:val="en-US" w:eastAsia="zh-CN" w:bidi="ar-SA"/>
-        </w:rPr>
-        <w:t>ONNX QDQ</w:t>
-      </w:r>
-      <w:r>
-        <w:rPr>
-          <w:rFonts w:hint="eastAsia" w:ascii="楷体" w:hAnsi="楷体" w:eastAsia="楷体" w:cs="楷体"/>
-          <w:color w:val="auto"/>
-          <w:spacing w:val="-3"/>
-          <w:kern w:val="4"/>
-          <w:sz w:val="21"/>
-          <w:szCs w:val="21"/>
-          <w:lang w:val="en-US" w:eastAsia="zh-CN"/>
-        </w:rPr>
-        <w:t xml:space="preserve"> 数值映射逻辑，掌握 </w:t>
-      </w:r>
-      <w:r>
-        <w:rPr>
-          <w:rFonts w:hint="eastAsia" w:ascii="Times New Roman" w:hAnsi="Times New Roman" w:eastAsia="楷体" w:cs="Times New Roman"/>
-          <w:b w:val="0"/>
-          <w:bCs w:val="0"/>
-          <w:color w:val="auto"/>
-          <w:w w:val="105"/>
-          <w:sz w:val="21"/>
-          <w:szCs w:val="21"/>
-          <w:lang w:val="en-US" w:eastAsia="zh-CN" w:bidi="ar-SA"/>
-        </w:rPr>
-        <w:t>TRT FP16</w:t>
-      </w:r>
-      <w:r>
-        <w:rPr>
-          <w:rFonts w:hint="eastAsia" w:ascii="楷体" w:hAnsi="楷体" w:eastAsia="楷体" w:cs="楷体"/>
-          <w:color w:val="auto"/>
-          <w:spacing w:val="-3"/>
-          <w:kern w:val="4"/>
-          <w:sz w:val="21"/>
-          <w:szCs w:val="21"/>
-          <w:lang w:val="en-US" w:eastAsia="zh-CN"/>
-        </w:rPr>
-        <w:t xml:space="preserve"> 与 </w:t>
-      </w:r>
-      <w:r>
-        <w:rPr>
-          <w:rFonts w:hint="eastAsia" w:ascii="Times New Roman" w:hAnsi="Times New Roman" w:eastAsia="楷体" w:cs="Times New Roman"/>
-          <w:b w:val="0"/>
-          <w:bCs w:val="0"/>
-          <w:color w:val="auto"/>
-          <w:w w:val="105"/>
-          <w:sz w:val="21"/>
-          <w:szCs w:val="21"/>
-          <w:lang w:val="en-US" w:eastAsia="zh-CN" w:bidi="ar-SA"/>
-        </w:rPr>
-        <w:t>INT8</w:t>
-      </w:r>
-      <w:r>
-        <w:rPr>
-          <w:rFonts w:hint="eastAsia" w:ascii="楷体" w:hAnsi="楷体" w:eastAsia="楷体" w:cs="楷体"/>
-          <w:color w:val="auto"/>
-          <w:spacing w:val="-3"/>
-          <w:kern w:val="4"/>
-          <w:sz w:val="21"/>
-          <w:szCs w:val="21"/>
-          <w:lang w:val="en-US" w:eastAsia="zh-CN"/>
-        </w:rPr>
-        <w:t xml:space="preserve"> 两套 </w:t>
-      </w:r>
-      <w:r>
-        <w:rPr>
-          <w:rFonts w:hint="eastAsia" w:ascii="Times New Roman" w:hAnsi="Times New Roman" w:eastAsia="楷体" w:cs="Times New Roman"/>
-          <w:b w:val="0"/>
-          <w:bCs w:val="0"/>
-          <w:color w:val="auto"/>
-          <w:w w:val="105"/>
-          <w:sz w:val="21"/>
-          <w:szCs w:val="21"/>
-          <w:lang w:val="en-US" w:eastAsia="zh-CN" w:bidi="ar-SA"/>
-        </w:rPr>
-        <w:t>TRT</w:t>
-      </w:r>
-      <w:r>
-        <w:rPr>
-          <w:rFonts w:hint="eastAsia" w:ascii="楷体" w:hAnsi="楷体" w:eastAsia="楷体" w:cs="楷体"/>
-          <w:color w:val="auto"/>
-          <w:spacing w:val="-3"/>
-          <w:kern w:val="4"/>
-          <w:sz w:val="21"/>
-          <w:szCs w:val="21"/>
-          <w:lang w:val="en-US" w:eastAsia="zh-CN"/>
-        </w:rPr>
-        <w:t xml:space="preserve"> 推理调优流程；基于 </w:t>
-      </w:r>
-      <w:r>
-        <w:rPr>
-          <w:rFonts w:hint="eastAsia" w:ascii="Times New Roman" w:hAnsi="Times New Roman" w:eastAsia="楷体" w:cs="Times New Roman"/>
-          <w:b w:val="0"/>
-          <w:bCs w:val="0"/>
-          <w:color w:val="auto"/>
-          <w:w w:val="105"/>
-          <w:sz w:val="21"/>
-          <w:szCs w:val="21"/>
-          <w:lang w:val="en-US" w:eastAsia="zh-CN" w:bidi="ar-SA"/>
-        </w:rPr>
-        <w:t>HuggingFace</w:t>
-      </w:r>
-      <w:r>
-        <w:rPr>
-          <w:rFonts w:hint="eastAsia" w:ascii="楷体" w:hAnsi="楷体" w:eastAsia="楷体" w:cs="楷体"/>
-          <w:color w:val="auto"/>
-          <w:spacing w:val="-3"/>
-          <w:kern w:val="4"/>
-          <w:sz w:val="21"/>
-          <w:szCs w:val="21"/>
-          <w:lang w:val="en-US" w:eastAsia="zh-CN"/>
-        </w:rPr>
-        <w:t xml:space="preserve"> 复现 </w:t>
-      </w:r>
-      <w:r>
-        <w:rPr>
-          <w:rFonts w:hint="eastAsia" w:ascii="Times New Roman" w:hAnsi="Times New Roman" w:eastAsia="楷体" w:cs="Times New Roman"/>
-          <w:b w:val="0"/>
-          <w:bCs w:val="0"/>
-          <w:color w:val="auto"/>
-          <w:w w:val="105"/>
-          <w:sz w:val="21"/>
-          <w:szCs w:val="21"/>
-          <w:lang w:val="en-US" w:eastAsia="zh-CN" w:bidi="ar-SA"/>
-        </w:rPr>
-        <w:t>ResNet、MobileNet、ViT、Swin-Transformer</w:t>
-      </w:r>
-      <w:r>
-        <w:rPr>
-          <w:rFonts w:hint="eastAsia" w:ascii="楷体" w:hAnsi="楷体" w:eastAsia="楷体" w:cs="楷体"/>
-          <w:color w:val="auto"/>
-          <w:spacing w:val="-3"/>
-          <w:kern w:val="4"/>
-          <w:sz w:val="21"/>
-          <w:szCs w:val="21"/>
-          <w:lang w:val="en-US" w:eastAsia="zh-CN"/>
-        </w:rPr>
-        <w:t xml:space="preserve"> 等主流视觉模型，完成</w:t>
-      </w:r>
-      <w:r>
-        <w:rPr>
-          <w:rFonts w:hint="eastAsia" w:ascii="楷体" w:hAnsi="楷体" w:eastAsia="楷体" w:cs="楷体"/>
-          <w:b/>
-          <w:bCs/>
-          <w:color w:val="auto"/>
-          <w:spacing w:val="-3"/>
-          <w:kern w:val="4"/>
-          <w:sz w:val="21"/>
-          <w:szCs w:val="21"/>
-          <w:lang w:val="en-US" w:eastAsia="zh-CN"/>
-        </w:rPr>
-        <w:t>多精度量化加速对照实验</w:t>
-      </w:r>
-      <w:r>
-        <w:rPr>
-          <w:rFonts w:hint="eastAsia" w:ascii="楷体" w:hAnsi="楷体" w:eastAsia="楷体" w:cs="楷体"/>
-          <w:color w:val="auto"/>
-          <w:spacing w:val="-3"/>
-          <w:kern w:val="4"/>
-          <w:sz w:val="21"/>
-          <w:szCs w:val="21"/>
-          <w:lang w:val="en-US" w:eastAsia="zh-CN"/>
-        </w:rPr>
-        <w:t>；</w:t>
-      </w:r>
-      <w:r>
-        <w:rPr>
-          <w:rFonts w:hint="eastAsia" w:ascii="楷体" w:hAnsi="楷体" w:eastAsia="楷体" w:cs="楷体"/>
-          <w:b/>
-          <w:bCs/>
-          <w:color w:val="auto"/>
-          <w:spacing w:val="-3"/>
-          <w:kern w:val="4"/>
-          <w:sz w:val="21"/>
-          <w:szCs w:val="21"/>
-          <w:lang w:val="en-US" w:eastAsia="zh-CN"/>
-        </w:rPr>
-        <w:t xml:space="preserve">独立重构 </w:t>
-      </w:r>
-      <w:r>
-        <w:rPr>
-          <w:rFonts w:hint="eastAsia" w:ascii="Times New Roman" w:hAnsi="Times New Roman" w:eastAsia="楷体" w:cs="Times New Roman"/>
-          <w:b/>
-          <w:bCs/>
-          <w:color w:val="auto"/>
-          <w:spacing w:val="-3"/>
-          <w:kern w:val="4"/>
-          <w:sz w:val="21"/>
-          <w:szCs w:val="21"/>
-          <w:lang w:val="en-US" w:eastAsia="zh-CN"/>
-        </w:rPr>
-        <w:t>Recon</w:t>
-      </w:r>
-      <w:r>
-        <w:rPr>
-          <w:rFonts w:hint="eastAsia" w:ascii="楷体" w:hAnsi="楷体" w:eastAsia="楷体" w:cs="楷体"/>
-          <w:b/>
-          <w:bCs/>
-          <w:color w:val="auto"/>
-          <w:spacing w:val="-3"/>
-          <w:kern w:val="4"/>
-          <w:sz w:val="21"/>
-          <w:szCs w:val="21"/>
-          <w:lang w:val="en-US" w:eastAsia="zh-CN"/>
-        </w:rPr>
-        <w:t xml:space="preserve"> 项目推理方案</w:t>
-      </w:r>
-      <w:r>
-        <w:rPr>
-          <w:rFonts w:hint="eastAsia" w:ascii="楷体" w:hAnsi="楷体" w:eastAsia="楷体" w:cs="楷体"/>
-          <w:color w:val="auto"/>
-          <w:spacing w:val="-3"/>
-          <w:kern w:val="4"/>
-          <w:sz w:val="21"/>
-          <w:szCs w:val="21"/>
-          <w:lang w:val="en-US" w:eastAsia="zh-CN"/>
-        </w:rPr>
-        <w:t xml:space="preserve">，编写一键部署、量化、自动化评测完整脚本；同时，我也针对 </w:t>
-      </w:r>
-      <w:r>
-        <w:rPr>
-          <w:rFonts w:hint="eastAsia" w:ascii="Times New Roman" w:hAnsi="Times New Roman" w:eastAsia="楷体" w:cs="Times New Roman"/>
-          <w:b w:val="0"/>
-          <w:bCs w:val="0"/>
-          <w:color w:val="auto"/>
-          <w:w w:val="105"/>
-          <w:sz w:val="21"/>
-          <w:szCs w:val="21"/>
-          <w:lang w:val="en-US" w:eastAsia="zh-CN" w:bidi="ar-SA"/>
-        </w:rPr>
-        <w:t>ViT</w:t>
-      </w:r>
-      <w:r>
-        <w:rPr>
-          <w:rFonts w:hint="eastAsia" w:ascii="楷体" w:hAnsi="楷体" w:eastAsia="楷体" w:cs="楷体"/>
-          <w:color w:val="auto"/>
-          <w:spacing w:val="-3"/>
-          <w:kern w:val="4"/>
-          <w:sz w:val="21"/>
-          <w:szCs w:val="21"/>
-          <w:lang w:val="en-US" w:eastAsia="zh-CN"/>
-        </w:rPr>
-        <w:t xml:space="preserve"> 与 </w:t>
-      </w:r>
-      <w:r>
-        <w:rPr>
-          <w:rFonts w:hint="eastAsia" w:ascii="Times New Roman" w:hAnsi="Times New Roman" w:eastAsia="楷体" w:cs="Times New Roman"/>
-          <w:b w:val="0"/>
-          <w:bCs w:val="0"/>
-          <w:color w:val="auto"/>
-          <w:w w:val="105"/>
-          <w:sz w:val="21"/>
-          <w:szCs w:val="21"/>
-          <w:lang w:val="en-US" w:eastAsia="zh-CN" w:bidi="ar-SA"/>
-        </w:rPr>
-        <w:t>Recon</w:t>
-      </w:r>
-      <w:r>
-        <w:rPr>
-          <w:rFonts w:hint="eastAsia" w:ascii="楷体" w:hAnsi="楷体" w:eastAsia="楷体" w:cs="楷体"/>
-          <w:color w:val="auto"/>
-          <w:spacing w:val="-3"/>
-          <w:kern w:val="4"/>
-          <w:sz w:val="21"/>
-          <w:szCs w:val="21"/>
-          <w:lang w:val="en-US" w:eastAsia="zh-CN"/>
-        </w:rPr>
-        <w:t xml:space="preserve"> 模型开展多规格 </w:t>
-      </w:r>
-      <w:r>
-        <w:rPr>
-          <w:rFonts w:hint="eastAsia" w:ascii="Times New Roman" w:hAnsi="Times New Roman" w:eastAsia="楷体" w:cs="Times New Roman"/>
-          <w:b w:val="0"/>
-          <w:bCs w:val="0"/>
-          <w:color w:val="auto"/>
-          <w:w w:val="105"/>
-          <w:sz w:val="21"/>
-          <w:szCs w:val="21"/>
-          <w:lang w:val="en-US" w:eastAsia="zh-CN" w:bidi="ar-SA"/>
-        </w:rPr>
-        <w:t>TRT INT8</w:t>
-      </w:r>
-      <w:r>
-        <w:rPr>
-          <w:rFonts w:hint="eastAsia" w:ascii="楷体" w:hAnsi="楷体" w:eastAsia="楷体" w:cs="楷体"/>
-          <w:color w:val="auto"/>
-          <w:spacing w:val="-3"/>
-          <w:kern w:val="4"/>
-          <w:sz w:val="21"/>
-          <w:szCs w:val="21"/>
-          <w:lang w:val="en-US" w:eastAsia="zh-CN"/>
-        </w:rPr>
-        <w:t xml:space="preserve"> 量化</w:t>
-      </w:r>
-      <w:r>
-        <w:rPr>
-          <w:rFonts w:hint="eastAsia" w:ascii="楷体" w:hAnsi="楷体" w:eastAsia="楷体" w:cs="楷体"/>
-          <w:b/>
-          <w:bCs/>
-          <w:color w:val="auto"/>
-          <w:spacing w:val="-3"/>
-          <w:kern w:val="4"/>
-          <w:sz w:val="21"/>
-          <w:szCs w:val="21"/>
-          <w:lang w:val="en-US" w:eastAsia="zh-CN"/>
-        </w:rPr>
-        <w:t>特定优化</w:t>
-      </w:r>
-      <w:r>
-        <w:rPr>
-          <w:rFonts w:hint="eastAsia" w:ascii="楷体" w:hAnsi="楷体" w:eastAsia="楷体" w:cs="楷体"/>
-          <w:color w:val="auto"/>
-          <w:spacing w:val="-3"/>
-          <w:kern w:val="4"/>
-          <w:sz w:val="21"/>
-          <w:szCs w:val="21"/>
-          <w:lang w:val="en-US" w:eastAsia="zh-CN"/>
-        </w:rPr>
-        <w:t>，在模型精度稳定维持 95% 以上的基础上有效提升推理速度。</w:t>
+          <w:b/>
+          <w:bCs/>
+          <w:color w:val="auto"/>
+          <w:spacing w:val="-3"/>
+          <w:kern w:val="4"/>
+          <w:sz w:val="21"/>
+          <w:szCs w:val="21"/>
+          <w:u w:val="single"/>
+          <w:lang w:val="en-US" w:eastAsia="zh-CN"/>
+        </w:rPr>
+        <w:t>内容</w:t>
+      </w:r>
+      <w:r>
+        <w:rPr>
+          <w:rFonts w:hint="eastAsia" w:ascii="楷体" w:hAnsi="楷体" w:eastAsia="楷体" w:cs="楷体"/>
+          <w:b/>
+          <w:bCs/>
+          <w:color w:val="auto"/>
+          <w:spacing w:val="-3"/>
+          <w:kern w:val="4"/>
+          <w:sz w:val="21"/>
+          <w:szCs w:val="21"/>
+          <w:u w:val="none"/>
+          <w:lang w:val="en-US" w:eastAsia="zh-CN"/>
+        </w:rPr>
+        <w:t>：</w:t>
+      </w:r>
+      <w:r>
+        <w:rPr>
+          <w:rFonts w:hint="eastAsia" w:ascii="楷体" w:hAnsi="楷体" w:eastAsia="楷体" w:cs="楷体"/>
+          <w:b w:val="0"/>
+          <w:bCs w:val="0"/>
+          <w:color w:val="auto"/>
+          <w:spacing w:val="-3"/>
+          <w:kern w:val="4"/>
+          <w:sz w:val="21"/>
+          <w:szCs w:val="21"/>
+          <w:u w:val="none"/>
+          <w:lang w:val="en-US" w:eastAsia="zh-CN"/>
+        </w:rPr>
+        <w:t xml:space="preserve">针对 </w:t>
+      </w:r>
+      <w:r>
+        <w:rPr>
+          <w:rFonts w:hint="eastAsia" w:ascii="Times New Roman" w:hAnsi="Times New Roman" w:eastAsia="楷体" w:cs="Times New Roman"/>
+          <w:b/>
+          <w:bCs/>
+          <w:color w:val="auto"/>
+          <w:spacing w:val="-3"/>
+          <w:kern w:val="4"/>
+          <w:sz w:val="21"/>
+          <w:szCs w:val="21"/>
+          <w:lang w:val="en-US" w:eastAsia="zh-CN" w:bidi="ar-SA"/>
+        </w:rPr>
+        <w:t xml:space="preserve">VLA-Agents </w:t>
+      </w:r>
+      <w:r>
+        <w:rPr>
+          <w:rFonts w:hint="eastAsia" w:ascii="楷体" w:hAnsi="楷体" w:eastAsia="楷体" w:cs="楷体"/>
+          <w:b w:val="0"/>
+          <w:bCs w:val="0"/>
+          <w:color w:val="auto"/>
+          <w:spacing w:val="-3"/>
+          <w:kern w:val="4"/>
+          <w:sz w:val="21"/>
+          <w:szCs w:val="21"/>
+          <w:u w:val="none"/>
+          <w:lang w:val="en-US" w:eastAsia="zh-CN"/>
+        </w:rPr>
+        <w:t>组合泛化与物理可行性难题，研究</w:t>
+      </w:r>
+      <w:r>
+        <w:rPr>
+          <w:rFonts w:hint="eastAsia" w:ascii="楷体" w:hAnsi="楷体" w:eastAsia="楷体" w:cs="楷体"/>
+          <w:b/>
+          <w:bCs/>
+          <w:color w:val="auto"/>
+          <w:spacing w:val="-3"/>
+          <w:kern w:val="4"/>
+          <w:sz w:val="21"/>
+          <w:szCs w:val="21"/>
+          <w:u w:val="none"/>
+          <w:lang w:val="en-US" w:eastAsia="zh-CN"/>
+        </w:rPr>
+        <w:t>基于能量框架的组合式扩散策略</w:t>
+      </w:r>
+      <w:r>
+        <w:rPr>
+          <w:rFonts w:hint="eastAsia" w:ascii="楷体" w:hAnsi="楷体" w:eastAsia="楷体" w:cs="楷体"/>
+          <w:b w:val="0"/>
+          <w:bCs w:val="0"/>
+          <w:color w:val="auto"/>
+          <w:spacing w:val="-3"/>
+          <w:kern w:val="4"/>
+          <w:sz w:val="21"/>
+          <w:szCs w:val="21"/>
+          <w:u w:val="none"/>
+          <w:lang w:val="en-US" w:eastAsia="zh-CN"/>
+        </w:rPr>
+        <w:t xml:space="preserve">。在 </w:t>
+      </w:r>
+      <w:r>
+        <w:rPr>
+          <w:rFonts w:hint="eastAsia" w:ascii="Times New Roman" w:hAnsi="Times New Roman" w:eastAsia="楷体" w:cs="Times New Roman"/>
+          <w:b w:val="0"/>
+          <w:bCs w:val="0"/>
+          <w:color w:val="auto"/>
+          <w:w w:val="105"/>
+          <w:sz w:val="21"/>
+          <w:szCs w:val="21"/>
+          <w:lang w:val="en-US" w:eastAsia="zh-CN" w:bidi="ar-SA"/>
+        </w:rPr>
+        <w:t>RoboCasa、RLBench</w:t>
+      </w:r>
+      <w:r>
+        <w:rPr>
+          <w:rFonts w:hint="eastAsia" w:ascii="楷体" w:hAnsi="楷体" w:eastAsia="楷体" w:cs="楷体"/>
+          <w:b w:val="0"/>
+          <w:bCs w:val="0"/>
+          <w:color w:val="auto"/>
+          <w:spacing w:val="-3"/>
+          <w:kern w:val="4"/>
+          <w:sz w:val="21"/>
+          <w:szCs w:val="21"/>
+          <w:u w:val="none"/>
+          <w:lang w:val="en-US" w:eastAsia="zh-CN"/>
+        </w:rPr>
+        <w:t xml:space="preserve"> 仿真基准上完成</w:t>
+      </w:r>
+      <w:r>
+        <w:rPr>
+          <w:rFonts w:hint="eastAsia" w:ascii="楷体" w:hAnsi="楷体" w:eastAsia="楷体" w:cs="楷体"/>
+          <w:b/>
+          <w:bCs/>
+          <w:color w:val="auto"/>
+          <w:spacing w:val="-3"/>
+          <w:kern w:val="4"/>
+          <w:sz w:val="21"/>
+          <w:szCs w:val="21"/>
+          <w:u w:val="none"/>
+          <w:lang w:val="en-US" w:eastAsia="zh-CN"/>
+        </w:rPr>
+        <w:t>模型训练</w:t>
+      </w:r>
+      <w:r>
+        <w:rPr>
+          <w:rFonts w:hint="eastAsia" w:ascii="楷体" w:hAnsi="楷体" w:eastAsia="楷体" w:cs="楷体"/>
+          <w:b w:val="0"/>
+          <w:bCs w:val="0"/>
+          <w:color w:val="auto"/>
+          <w:spacing w:val="-3"/>
+          <w:kern w:val="4"/>
+          <w:sz w:val="21"/>
+          <w:szCs w:val="21"/>
+          <w:u w:val="none"/>
+          <w:lang w:val="en-US" w:eastAsia="zh-CN"/>
+        </w:rPr>
+        <w:t>、</w:t>
+      </w:r>
+      <w:r>
+        <w:rPr>
+          <w:rFonts w:hint="eastAsia" w:ascii="楷体" w:hAnsi="楷体" w:eastAsia="楷体" w:cs="楷体"/>
+          <w:b/>
+          <w:bCs/>
+          <w:color w:val="auto"/>
+          <w:spacing w:val="-3"/>
+          <w:kern w:val="4"/>
+          <w:sz w:val="21"/>
+          <w:szCs w:val="21"/>
+          <w:u w:val="none"/>
+          <w:lang w:val="en-US" w:eastAsia="zh-CN"/>
+        </w:rPr>
+        <w:t>多组消融对照实验</w:t>
+      </w:r>
+      <w:r>
+        <w:rPr>
+          <w:rFonts w:hint="eastAsia" w:ascii="楷体" w:hAnsi="楷体" w:eastAsia="楷体" w:cs="楷体"/>
+          <w:b w:val="0"/>
+          <w:bCs w:val="0"/>
+          <w:color w:val="auto"/>
+          <w:spacing w:val="-3"/>
+          <w:kern w:val="4"/>
+          <w:sz w:val="21"/>
+          <w:szCs w:val="21"/>
+          <w:u w:val="none"/>
+          <w:lang w:val="en-US" w:eastAsia="zh-CN"/>
+        </w:rPr>
+        <w:t>，同时</w:t>
+      </w:r>
+      <w:r>
+        <w:rPr>
+          <w:rFonts w:hint="eastAsia" w:ascii="楷体" w:hAnsi="楷体" w:eastAsia="楷体" w:cs="楷体"/>
+          <w:b/>
+          <w:bCs/>
+          <w:color w:val="auto"/>
+          <w:spacing w:val="-3"/>
+          <w:kern w:val="4"/>
+          <w:sz w:val="21"/>
+          <w:szCs w:val="21"/>
+          <w:u w:val="none"/>
+          <w:lang w:val="en-US" w:eastAsia="zh-CN"/>
+        </w:rPr>
+        <w:t>参与真实机器人抓取放置实物实验</w:t>
+      </w:r>
+      <w:r>
+        <w:rPr>
+          <w:rFonts w:hint="eastAsia" w:ascii="楷体" w:hAnsi="楷体" w:eastAsia="楷体" w:cs="楷体"/>
+          <w:b w:val="0"/>
+          <w:bCs w:val="0"/>
+          <w:color w:val="auto"/>
+          <w:spacing w:val="-3"/>
+          <w:kern w:val="4"/>
+          <w:sz w:val="21"/>
+          <w:szCs w:val="21"/>
+          <w:u w:val="none"/>
+          <w:lang w:val="en-US" w:eastAsia="zh-CN"/>
+        </w:rPr>
+        <w:t xml:space="preserve">，负责模型调参、轨迹优化、指标统计与结果分析；基于 </w:t>
+      </w:r>
+      <w:r>
+        <w:rPr>
+          <w:rFonts w:hint="eastAsia" w:ascii="Times New Roman" w:hAnsi="Times New Roman" w:eastAsia="楷体" w:cs="Times New Roman"/>
+          <w:b w:val="0"/>
+          <w:bCs w:val="0"/>
+          <w:color w:val="auto"/>
+          <w:w w:val="105"/>
+          <w:sz w:val="21"/>
+          <w:szCs w:val="21"/>
+          <w:lang w:val="en-US" w:eastAsia="zh-CN" w:bidi="ar-SA"/>
+        </w:rPr>
+        <w:t>PyTorch</w:t>
+      </w:r>
+      <w:r>
+        <w:rPr>
+          <w:rFonts w:hint="eastAsia" w:ascii="楷体" w:hAnsi="楷体" w:eastAsia="楷体" w:cs="楷体"/>
+          <w:b w:val="0"/>
+          <w:bCs w:val="0"/>
+          <w:color w:val="auto"/>
+          <w:spacing w:val="-3"/>
+          <w:kern w:val="4"/>
+          <w:sz w:val="21"/>
+          <w:szCs w:val="21"/>
+          <w:u w:val="none"/>
+          <w:lang w:val="en-US" w:eastAsia="zh-CN"/>
+        </w:rPr>
+        <w:t xml:space="preserve"> 完成扩散策略代码迭代，针对轨迹振荡、运动学不可行问题引入物理约束模块；同时在科研实习期间，</w:t>
+      </w:r>
+      <w:bookmarkStart w:id="2" w:name="_GoBack"/>
+      <w:bookmarkEnd w:id="2"/>
+      <w:r>
+        <w:rPr>
+          <w:rFonts w:hint="eastAsia" w:ascii="楷体" w:hAnsi="楷体" w:eastAsia="楷体" w:cs="楷体"/>
+          <w:b w:val="0"/>
+          <w:bCs w:val="0"/>
+          <w:color w:val="auto"/>
+          <w:spacing w:val="-3"/>
+          <w:kern w:val="4"/>
+          <w:sz w:val="21"/>
+          <w:szCs w:val="21"/>
+          <w:u w:val="none"/>
+          <w:lang w:val="en-US" w:eastAsia="zh-CN"/>
+        </w:rPr>
+        <w:t>系统调研具身智能、机器人模仿学习方向前沿文献，</w:t>
+      </w:r>
+      <w:r>
+        <w:rPr>
+          <w:rFonts w:hint="eastAsia" w:ascii="楷体" w:hAnsi="楷体" w:eastAsia="楷体" w:cs="楷体"/>
+          <w:b/>
+          <w:bCs/>
+          <w:color w:val="auto"/>
+          <w:spacing w:val="-3"/>
+          <w:kern w:val="4"/>
+          <w:sz w:val="21"/>
+          <w:szCs w:val="21"/>
+          <w:u w:val="none"/>
+          <w:lang w:val="en-US" w:eastAsia="zh-CN"/>
+        </w:rPr>
+        <w:t>参与论文实验章节撰写</w:t>
+      </w:r>
+      <w:r>
+        <w:rPr>
+          <w:rFonts w:hint="eastAsia" w:ascii="楷体" w:hAnsi="楷体" w:eastAsia="楷体" w:cs="楷体"/>
+          <w:b w:val="0"/>
+          <w:bCs w:val="0"/>
+          <w:color w:val="auto"/>
+          <w:spacing w:val="-3"/>
+          <w:kern w:val="4"/>
+          <w:sz w:val="21"/>
+          <w:szCs w:val="21"/>
+          <w:u w:val="none"/>
+          <w:lang w:val="en-US" w:eastAsia="zh-CN"/>
+        </w:rPr>
+        <w:t>、图表整理与文稿修订，相关工作</w:t>
+      </w:r>
+      <w:r>
+        <w:rPr>
+          <w:rFonts w:hint="eastAsia" w:ascii="Times New Roman" w:hAnsi="Times New Roman" w:eastAsia="楷体" w:cs="Times New Roman"/>
+          <w:b/>
+          <w:bCs/>
+          <w:color w:val="auto"/>
+          <w:w w:val="105"/>
+          <w:sz w:val="21"/>
+          <w:szCs w:val="21"/>
+          <w:lang w:val="en-US" w:eastAsia="zh-CN" w:bidi="ar-SA"/>
+        </w:rPr>
+        <w:t>《 Compositional Diffusion Policy for Vision–Language–Action Agents》</w:t>
+      </w:r>
+      <w:r>
+        <w:rPr>
+          <w:rFonts w:hint="eastAsia" w:ascii="楷体" w:hAnsi="楷体" w:eastAsia="楷体" w:cs="楷体"/>
+          <w:b w:val="0"/>
+          <w:bCs w:val="0"/>
+          <w:color w:val="auto"/>
+          <w:spacing w:val="-3"/>
+          <w:kern w:val="4"/>
+          <w:sz w:val="21"/>
+          <w:szCs w:val="21"/>
+          <w:u w:val="none"/>
+          <w:lang w:val="en-US" w:eastAsia="zh-CN"/>
+        </w:rPr>
+        <w:t>投稿</w:t>
+      </w:r>
+      <w:r>
+        <w:rPr>
+          <w:rFonts w:hint="eastAsia" w:ascii="楷体" w:hAnsi="楷体" w:eastAsia="楷体" w:cs="楷体"/>
+          <w:b/>
+          <w:bCs/>
+          <w:color w:val="auto"/>
+          <w:spacing w:val="-3"/>
+          <w:kern w:val="4"/>
+          <w:sz w:val="21"/>
+          <w:szCs w:val="21"/>
+          <w:u w:val="none"/>
+          <w:lang w:val="en-US" w:eastAsia="zh-CN"/>
+        </w:rPr>
+        <w:t xml:space="preserve"> </w:t>
+      </w:r>
+      <w:r>
+        <w:rPr>
+          <w:rFonts w:hint="eastAsia" w:ascii="Times New Roman" w:hAnsi="Times New Roman" w:eastAsia="楷体" w:cs="Times New Roman"/>
+          <w:b/>
+          <w:bCs/>
+          <w:color w:val="auto"/>
+          <w:w w:val="105"/>
+          <w:sz w:val="21"/>
+          <w:szCs w:val="21"/>
+          <w:lang w:val="en-US" w:eastAsia="zh-CN" w:bidi="ar-SA"/>
+        </w:rPr>
+        <w:t>CoRL</w:t>
+      </w:r>
+      <w:r>
+        <w:rPr>
+          <w:rFonts w:hint="eastAsia" w:ascii="楷体" w:hAnsi="楷体" w:eastAsia="楷体" w:cs="楷体"/>
+          <w:b/>
+          <w:bCs/>
+          <w:color w:val="auto"/>
+          <w:spacing w:val="-3"/>
+          <w:kern w:val="4"/>
+          <w:sz w:val="21"/>
+          <w:szCs w:val="21"/>
+          <w:u w:val="none"/>
+          <w:lang w:val="en-US" w:eastAsia="zh-CN"/>
+        </w:rPr>
+        <w:t xml:space="preserve"> 2026</w:t>
+      </w:r>
+      <w:r>
+        <w:rPr>
+          <w:rFonts w:hint="eastAsia" w:ascii="Times New Roman" w:hAnsi="Times New Roman" w:eastAsia="楷体" w:cs="Times New Roman"/>
+          <w:b/>
+          <w:bCs/>
+          <w:color w:val="auto"/>
+          <w:spacing w:val="-3"/>
+          <w:kern w:val="4"/>
+          <w:sz w:val="21"/>
+          <w:szCs w:val="21"/>
+          <w:lang w:val="en-US" w:eastAsia="zh-CN" w:bidi="ar-SA"/>
+        </w:rPr>
+        <w:t>（Accepted）</w:t>
+      </w:r>
+      <w:r>
+        <w:rPr>
+          <w:rFonts w:hint="eastAsia" w:ascii="楷体" w:hAnsi="楷体" w:eastAsia="楷体" w:cs="楷体"/>
+          <w:b w:val="0"/>
+          <w:bCs w:val="0"/>
+          <w:color w:val="auto"/>
+          <w:spacing w:val="-3"/>
+          <w:kern w:val="4"/>
+          <w:sz w:val="21"/>
+          <w:szCs w:val="21"/>
+          <w:u w:val="none"/>
+          <w:lang w:val="en-US" w:eastAsia="zh-CN"/>
+        </w:rPr>
+        <w:t>。实习期间科研表现</w:t>
+      </w:r>
+      <w:r>
+        <w:rPr>
+          <w:rFonts w:hint="eastAsia" w:ascii="楷体" w:hAnsi="楷体" w:eastAsia="楷体" w:cs="楷体"/>
+          <w:b/>
+          <w:bCs/>
+          <w:color w:val="auto"/>
+          <w:spacing w:val="-3"/>
+          <w:kern w:val="4"/>
+          <w:sz w:val="21"/>
+          <w:szCs w:val="21"/>
+          <w:u w:val="none"/>
+          <w:lang w:val="en-US" w:eastAsia="zh-CN"/>
+        </w:rPr>
+        <w:t>得到老师认可</w:t>
+      </w:r>
+      <w:r>
+        <w:rPr>
+          <w:rFonts w:hint="eastAsia" w:ascii="楷体" w:hAnsi="楷体" w:eastAsia="楷体" w:cs="楷体"/>
+          <w:b w:val="0"/>
+          <w:bCs w:val="0"/>
+          <w:color w:val="auto"/>
+          <w:spacing w:val="-3"/>
+          <w:kern w:val="4"/>
+          <w:sz w:val="21"/>
+          <w:szCs w:val="21"/>
+          <w:u w:val="none"/>
+          <w:lang w:val="en-US" w:eastAsia="zh-CN"/>
+        </w:rPr>
+        <w:t>，并最终</w:t>
+      </w:r>
+      <w:r>
+        <w:rPr>
+          <w:rFonts w:hint="eastAsia" w:ascii="楷体" w:hAnsi="楷体" w:eastAsia="楷体" w:cs="楷体"/>
+          <w:b/>
+          <w:bCs/>
+          <w:color w:val="auto"/>
+          <w:spacing w:val="-3"/>
+          <w:kern w:val="4"/>
+          <w:sz w:val="21"/>
+          <w:szCs w:val="21"/>
+          <w:u w:val="none"/>
+          <w:lang w:val="en-US" w:eastAsia="zh-CN"/>
+        </w:rPr>
+        <w:t>获得老师推荐信并加入老师课题组</w:t>
+      </w:r>
+      <w:r>
+        <w:rPr>
+          <w:rFonts w:hint="eastAsia" w:ascii="楷体" w:hAnsi="楷体" w:eastAsia="楷体" w:cs="楷体"/>
+          <w:b w:val="0"/>
+          <w:bCs w:val="0"/>
+          <w:color w:val="auto"/>
+          <w:spacing w:val="-3"/>
+          <w:kern w:val="4"/>
+          <w:sz w:val="21"/>
+          <w:szCs w:val="21"/>
+          <w:u w:val="none"/>
+          <w:lang w:val="en-US" w:eastAsia="zh-CN"/>
+        </w:rPr>
+        <w:t>。</w:t>
       </w:r>
     </w:p>
     <w:p>
@@ -2552,9 +2760,23 @@
           <w:kern w:val="4"/>
           <w:sz w:val="21"/>
           <w:szCs w:val="21"/>
-          <w:lang w:val="en-US" w:eastAsia="zh-CN"/>
-        </w:rPr>
-        <w:t>最终实现文本生成与端到端可运行的语言模型系统</w:t>
+          <w:lang w:val="en-US" w:eastAsia="zh-CN" w:bidi="ar-SA"/>
+        </w:rPr>
+        <w:t>最终实</w:t>
+      </w:r>
+      <w:r>
+        <w:rPr>
+          <w:rFonts w:hint="eastAsia" w:ascii="楷体" w:hAnsi="楷体" w:eastAsia="楷体" w:cs="楷体"/>
+          <w:b/>
+          <w:bCs/>
+          <w:color w:val="auto"/>
+          <w:spacing w:val="-3"/>
+          <w:kern w:val="4"/>
+          <w:sz w:val="21"/>
+          <w:szCs w:val="21"/>
+          <w:lang w:val="en-US" w:eastAsia="zh-CN" w:bidi="ar-SA"/>
+        </w:rPr>
+        <w:t>现文本生成与端到端可运行的语言模型系统</w:t>
       </w:r>
       <w:r>
         <w:rPr>
@@ -3018,7 +3240,20 @@
           <w:szCs w:val="21"/>
           <w:lang w:val="en-US" w:eastAsia="zh-CN" w:bidi="ar-SA"/>
         </w:rPr>
-        <w:t>RealSense</w:t>
+        <w:t>RealSe</w:t>
+      </w:r>
+      <w:r>
+        <w:rPr>
+          <w:rFonts w:hint="eastAsia" w:ascii="Times New Roman" w:hAnsi="Times New Roman" w:eastAsia="楷体" w:cs="Times New Roman"/>
+          <w:b w:val="0"/>
+          <w:bCs w:val="0"/>
+          <w:color w:val="auto"/>
+          <w:w w:val="105"/>
+          <w:sz w:val="21"/>
+          <w:szCs w:val="21"/>
+          <w:lang w:val="en-US" w:eastAsia="zh-CN" w:bidi="ar-SA"/>
+        </w:rPr>
+        <w:t>nse</w:t>
       </w:r>
       <w:r>
         <w:rPr>
@@ -5164,443 +5399,6 @@
     </w:p>
     <w:p>
       <w:pPr>
-        <w:pStyle w:val="14"/>
-        <w:keepNext w:val="0"/>
-        <w:keepLines w:val="0"/>
-        <w:pageBreakBefore w:val="0"/>
-        <w:widowControl w:val="0"/>
-        <w:numPr>
-          <w:ilvl w:val="0"/>
-          <w:numId w:val="1"/>
-        </w:numPr>
-        <w:tabs>
-          <w:tab w:val="left" w:pos="395"/>
-          <w:tab w:val="left" w:pos="2420"/>
-          <w:tab w:val="left" w:pos="2640"/>
-          <w:tab w:val="left" w:pos="5940"/>
-          <w:tab w:val="left" w:pos="7260"/>
-          <w:tab w:val="left" w:pos="10120"/>
-        </w:tabs>
-        <w:kinsoku/>
-        <w:wordWrap/>
-        <w:overflowPunct/>
-        <w:topLinePunct w:val="0"/>
-        <w:autoSpaceDE w:val="0"/>
-        <w:autoSpaceDN w:val="0"/>
-        <w:bidi w:val="0"/>
-        <w:adjustRightInd/>
-        <w:snapToGrid/>
-        <w:spacing w:line="240" w:lineRule="auto"/>
-        <w:ind w:left="391" w:hanging="193"/>
-        <w:textAlignment w:val="auto"/>
-        <w:rPr>
-          <w:rFonts w:hint="eastAsia" w:ascii="楷体" w:hAnsi="楷体" w:eastAsia="楷体" w:cs="楷体"/>
-          <w:b/>
-          <w:bCs/>
-          <w:color w:val="auto"/>
-          <w:spacing w:val="-3"/>
-          <w:kern w:val="4"/>
-          <w:sz w:val="21"/>
-          <w:szCs w:val="21"/>
-          <w:lang w:val="en-US" w:eastAsia="zh-CN"/>
-        </w:rPr>
-      </w:pPr>
-      <w:r>
-        <w:rPr>
-          <w:rFonts w:hint="eastAsia" w:ascii="Times New Roman" w:hAnsi="Times New Roman" w:eastAsia="楷体" w:cs="Times New Roman"/>
-          <w:b/>
-          <w:bCs/>
-          <w:color w:val="auto"/>
-          <w:spacing w:val="-3"/>
-          <w:kern w:val="4"/>
-          <w:sz w:val="21"/>
-          <w:szCs w:val="21"/>
-          <w:lang w:val="en-US" w:eastAsia="zh-CN"/>
-        </w:rPr>
-        <w:t>2025.04</w:t>
-      </w:r>
-      <w:r>
-        <w:rPr>
-          <w:rFonts w:hint="eastAsia" w:ascii="Times New Roman" w:hAnsi="Times New Roman" w:eastAsia="楷体"/>
-          <w:b/>
-          <w:bCs/>
-          <w:color w:val="auto"/>
-          <w:w w:val="105"/>
-          <w:sz w:val="21"/>
-          <w:szCs w:val="21"/>
-          <w:lang w:val="en-US" w:eastAsia="zh-CN"/>
-        </w:rPr>
-        <w:tab/>
-      </w:r>
-      <w:r>
-        <w:rPr>
-          <w:rFonts w:hint="eastAsia" w:ascii="楷体" w:hAnsi="楷体" w:eastAsia="楷体" w:cs="楷体"/>
-          <w:b/>
-          <w:bCs/>
-          <w:color w:val="auto"/>
-          <w:spacing w:val="-3"/>
-          <w:kern w:val="4"/>
-          <w:sz w:val="21"/>
-          <w:szCs w:val="21"/>
-          <w:lang w:val="en-US" w:eastAsia="zh-CN"/>
-        </w:rPr>
-        <w:t>第十五届蓝桥杯全国软件和信息技术大赛</w:t>
-      </w:r>
-      <w:r>
-        <w:rPr>
-          <w:rFonts w:hint="eastAsia" w:ascii="楷体" w:hAnsi="楷体" w:eastAsia="楷体" w:cs="楷体"/>
-          <w:b/>
-          <w:bCs/>
-          <w:color w:val="auto"/>
-          <w:spacing w:val="-3"/>
-          <w:kern w:val="4"/>
-          <w:sz w:val="21"/>
-          <w:szCs w:val="21"/>
-          <w:lang w:val="en-US" w:eastAsia="zh-CN"/>
-        </w:rPr>
-        <w:tab/>
-      </w:r>
-      <w:r>
-        <w:rPr>
-          <w:rFonts w:hint="eastAsia" w:ascii="楷体" w:hAnsi="楷体" w:eastAsia="楷体" w:cs="楷体"/>
-          <w:b/>
-          <w:bCs/>
-          <w:color w:val="auto"/>
-          <w:spacing w:val="-3"/>
-          <w:kern w:val="4"/>
-          <w:sz w:val="21"/>
-          <w:szCs w:val="21"/>
-          <w:lang w:val="en-US" w:eastAsia="zh-CN"/>
-        </w:rPr>
-        <w:t>省二等奖</w:t>
-      </w:r>
-      <w:r>
-        <w:rPr>
-          <w:rFonts w:hint="eastAsia" w:ascii="楷体" w:hAnsi="楷体" w:eastAsia="楷体" w:cs="楷体"/>
-          <w:b/>
-          <w:bCs/>
-          <w:color w:val="auto"/>
-          <w:spacing w:val="-3"/>
-          <w:kern w:val="4"/>
-          <w:sz w:val="21"/>
-          <w:szCs w:val="21"/>
-          <w:lang w:val="en-US" w:eastAsia="zh-CN"/>
-        </w:rPr>
-        <w:tab/>
-      </w:r>
-      <w:r>
-        <w:rPr>
-          <w:rFonts w:hint="eastAsia" w:ascii="楷体" w:hAnsi="楷体" w:eastAsia="楷体" w:cs="楷体"/>
-          <w:b/>
-          <w:bCs/>
-          <w:color w:val="auto"/>
-          <w:spacing w:val="-3"/>
-          <w:kern w:val="4"/>
-          <w:sz w:val="21"/>
-          <w:szCs w:val="21"/>
-          <w:lang w:val="en-US" w:eastAsia="zh-CN"/>
-        </w:rPr>
-        <w:t>个人赛</w:t>
-      </w:r>
-    </w:p>
-    <w:p>
-      <w:pPr>
-        <w:pStyle w:val="14"/>
-        <w:keepNext w:val="0"/>
-        <w:keepLines w:val="0"/>
-        <w:pageBreakBefore w:val="0"/>
-        <w:widowControl w:val="0"/>
-        <w:numPr>
-          <w:ilvl w:val="0"/>
-          <w:numId w:val="1"/>
-        </w:numPr>
-        <w:tabs>
-          <w:tab w:val="left" w:pos="395"/>
-          <w:tab w:val="left" w:pos="2420"/>
-          <w:tab w:val="left" w:pos="2640"/>
-          <w:tab w:val="left" w:pos="5940"/>
-          <w:tab w:val="left" w:pos="7260"/>
-          <w:tab w:val="left" w:pos="10120"/>
-        </w:tabs>
-        <w:kinsoku/>
-        <w:wordWrap/>
-        <w:overflowPunct/>
-        <w:topLinePunct w:val="0"/>
-        <w:autoSpaceDE w:val="0"/>
-        <w:autoSpaceDN w:val="0"/>
-        <w:bidi w:val="0"/>
-        <w:adjustRightInd/>
-        <w:snapToGrid/>
-        <w:spacing w:line="240" w:lineRule="auto"/>
-        <w:ind w:left="391" w:hanging="193"/>
-        <w:textAlignment w:val="auto"/>
-        <w:rPr>
-          <w:rFonts w:hint="eastAsia" w:ascii="楷体" w:hAnsi="楷体" w:eastAsia="楷体" w:cs="楷体"/>
-          <w:b/>
-          <w:bCs/>
-          <w:color w:val="auto"/>
-          <w:spacing w:val="-3"/>
-          <w:kern w:val="4"/>
-          <w:sz w:val="21"/>
-          <w:szCs w:val="21"/>
-          <w:lang w:val="en-US" w:eastAsia="zh-CN"/>
-        </w:rPr>
-      </w:pPr>
-      <w:r>
-        <w:rPr>
-          <w:rFonts w:hint="eastAsia" w:ascii="Times New Roman" w:hAnsi="Times New Roman" w:eastAsia="楷体" w:cs="Times New Roman"/>
-          <w:b/>
-          <w:bCs/>
-          <w:color w:val="auto"/>
-          <w:spacing w:val="-3"/>
-          <w:kern w:val="4"/>
-          <w:sz w:val="21"/>
-          <w:szCs w:val="21"/>
-          <w:lang w:val="en-US" w:eastAsia="zh-CN"/>
-        </w:rPr>
-        <w:t>2025.05</w:t>
-      </w:r>
-      <w:r>
-        <w:rPr>
-          <w:rFonts w:hint="eastAsia" w:ascii="Times New Roman" w:hAnsi="Times New Roman" w:eastAsia="楷体"/>
-          <w:b/>
-          <w:bCs/>
-          <w:color w:val="auto"/>
-          <w:w w:val="105"/>
-          <w:sz w:val="21"/>
-          <w:szCs w:val="21"/>
-          <w:lang w:val="en-US" w:eastAsia="zh-CN"/>
-        </w:rPr>
-        <w:tab/>
-      </w:r>
-      <w:r>
-        <w:rPr>
-          <w:rFonts w:hint="eastAsia" w:ascii="楷体" w:hAnsi="楷体" w:eastAsia="楷体" w:cs="楷体"/>
-          <w:b/>
-          <w:bCs/>
-          <w:color w:val="auto"/>
-          <w:spacing w:val="-3"/>
-          <w:kern w:val="4"/>
-          <w:sz w:val="21"/>
-          <w:szCs w:val="21"/>
-          <w:lang w:val="en-US" w:eastAsia="zh-CN"/>
-        </w:rPr>
-        <w:t>第十八届中国大学生计算机设计竞赛</w:t>
-      </w:r>
-      <w:r>
-        <w:rPr>
-          <w:rFonts w:hint="eastAsia" w:ascii="楷体" w:hAnsi="楷体" w:eastAsia="楷体" w:cs="楷体"/>
-          <w:b/>
-          <w:bCs/>
-          <w:color w:val="auto"/>
-          <w:spacing w:val="-3"/>
-          <w:kern w:val="4"/>
-          <w:sz w:val="21"/>
-          <w:szCs w:val="21"/>
-          <w:lang w:val="en-US" w:eastAsia="zh-CN"/>
-        </w:rPr>
-        <w:tab/>
-      </w:r>
-      <w:r>
-        <w:rPr>
-          <w:rFonts w:hint="eastAsia" w:ascii="楷体" w:hAnsi="楷体" w:eastAsia="楷体" w:cs="楷体"/>
-          <w:b/>
-          <w:bCs/>
-          <w:color w:val="auto"/>
-          <w:spacing w:val="-3"/>
-          <w:kern w:val="4"/>
-          <w:sz w:val="21"/>
-          <w:szCs w:val="21"/>
-          <w:lang w:val="en-US" w:eastAsia="zh-CN"/>
-        </w:rPr>
-        <w:tab/>
-      </w:r>
-      <w:r>
-        <w:rPr>
-          <w:rFonts w:hint="eastAsia" w:ascii="楷体" w:hAnsi="楷体" w:eastAsia="楷体" w:cs="楷体"/>
-          <w:b/>
-          <w:bCs/>
-          <w:color w:val="auto"/>
-          <w:spacing w:val="-3"/>
-          <w:kern w:val="4"/>
-          <w:sz w:val="21"/>
-          <w:szCs w:val="21"/>
-          <w:lang w:val="en-US" w:eastAsia="zh-CN"/>
-        </w:rPr>
-        <w:t>省三等奖</w:t>
-      </w:r>
-      <w:r>
-        <w:rPr>
-          <w:rFonts w:hint="eastAsia" w:ascii="楷体" w:hAnsi="楷体" w:eastAsia="楷体" w:cs="楷体"/>
-          <w:b/>
-          <w:bCs/>
-          <w:color w:val="auto"/>
-          <w:spacing w:val="-3"/>
-          <w:kern w:val="4"/>
-          <w:sz w:val="21"/>
-          <w:szCs w:val="21"/>
-          <w:lang w:val="en-US" w:eastAsia="zh-CN"/>
-        </w:rPr>
-        <w:tab/>
-      </w:r>
-      <w:r>
-        <w:rPr>
-          <w:rFonts w:hint="eastAsia" w:ascii="楷体" w:hAnsi="楷体" w:eastAsia="楷体" w:cs="楷体"/>
-          <w:b/>
-          <w:bCs/>
-          <w:color w:val="auto"/>
-          <w:spacing w:val="-3"/>
-          <w:kern w:val="4"/>
-          <w:sz w:val="21"/>
-          <w:szCs w:val="21"/>
-          <w:lang w:val="en-US" w:eastAsia="zh-CN"/>
-        </w:rPr>
-        <w:t>核心队员</w:t>
-      </w:r>
-    </w:p>
-    <w:p>
-      <w:pPr>
-        <w:pStyle w:val="14"/>
-        <w:keepNext w:val="0"/>
-        <w:keepLines w:val="0"/>
-        <w:pageBreakBefore w:val="0"/>
-        <w:widowControl w:val="0"/>
-        <w:numPr>
-          <w:ilvl w:val="0"/>
-          <w:numId w:val="1"/>
-        </w:numPr>
-        <w:tabs>
-          <w:tab w:val="left" w:pos="395"/>
-          <w:tab w:val="left" w:pos="2420"/>
-          <w:tab w:val="left" w:pos="2640"/>
-          <w:tab w:val="left" w:pos="5940"/>
-          <w:tab w:val="left" w:pos="7260"/>
-          <w:tab w:val="left" w:pos="10120"/>
-        </w:tabs>
-        <w:kinsoku/>
-        <w:wordWrap/>
-        <w:overflowPunct/>
-        <w:topLinePunct w:val="0"/>
-        <w:autoSpaceDE w:val="0"/>
-        <w:autoSpaceDN w:val="0"/>
-        <w:bidi w:val="0"/>
-        <w:adjustRightInd/>
-        <w:snapToGrid/>
-        <w:spacing w:line="240" w:lineRule="auto"/>
-        <w:ind w:left="391" w:hanging="193"/>
-        <w:textAlignment w:val="auto"/>
-        <w:rPr>
-          <w:rFonts w:hint="eastAsia" w:ascii="楷体" w:hAnsi="楷体" w:eastAsia="楷体" w:cs="楷体"/>
-          <w:b/>
-          <w:bCs/>
-          <w:color w:val="auto"/>
-          <w:spacing w:val="-3"/>
-          <w:kern w:val="4"/>
-          <w:sz w:val="21"/>
-          <w:szCs w:val="21"/>
-          <w:lang w:val="en-US" w:eastAsia="zh-CN"/>
-        </w:rPr>
-      </w:pPr>
-      <w:r>
-        <w:rPr>
-          <w:rFonts w:hint="eastAsia" w:ascii="Times New Roman" w:hAnsi="Times New Roman" w:eastAsia="楷体" w:cs="Times New Roman"/>
-          <w:b/>
-          <w:bCs/>
-          <w:color w:val="auto"/>
-          <w:spacing w:val="-3"/>
-          <w:kern w:val="4"/>
-          <w:sz w:val="21"/>
-          <w:szCs w:val="21"/>
-          <w:lang w:val="en-US" w:eastAsia="zh-CN"/>
-        </w:rPr>
-        <w:t>2025.09</w:t>
-      </w:r>
-      <w:r>
-        <w:rPr>
-          <w:rFonts w:hint="eastAsia" w:ascii="Times New Roman" w:hAnsi="Times New Roman" w:eastAsia="楷体"/>
-          <w:b/>
-          <w:bCs/>
-          <w:color w:val="auto"/>
-          <w:w w:val="105"/>
-          <w:sz w:val="21"/>
-          <w:szCs w:val="21"/>
-          <w:lang w:val="en-US" w:eastAsia="zh-CN"/>
-        </w:rPr>
-        <w:tab/>
-      </w:r>
-      <w:r>
-        <w:rPr>
-          <w:rFonts w:hint="eastAsia" w:ascii="楷体" w:hAnsi="楷体" w:eastAsia="楷体" w:cs="楷体"/>
-          <w:b/>
-          <w:bCs/>
-          <w:color w:val="auto"/>
-          <w:spacing w:val="-3"/>
-          <w:kern w:val="4"/>
-          <w:sz w:val="21"/>
-          <w:szCs w:val="21"/>
-          <w:lang w:val="en-US" w:eastAsia="zh-CN"/>
-        </w:rPr>
-        <w:t>2025年高教社杯全国大学生数学建模竞赛</w:t>
-      </w:r>
-      <w:r>
-        <w:rPr>
-          <w:rFonts w:hint="eastAsia" w:ascii="楷体" w:hAnsi="楷体" w:eastAsia="楷体" w:cs="楷体"/>
-          <w:b/>
-          <w:bCs/>
-          <w:color w:val="auto"/>
-          <w:spacing w:val="-3"/>
-          <w:kern w:val="4"/>
-          <w:sz w:val="21"/>
-          <w:szCs w:val="21"/>
-          <w:lang w:val="en-US" w:eastAsia="zh-CN"/>
-        </w:rPr>
-        <w:tab/>
-      </w:r>
-      <w:r>
-        <w:rPr>
-          <w:rFonts w:hint="eastAsia" w:ascii="楷体" w:hAnsi="楷体" w:eastAsia="楷体" w:cs="楷体"/>
-          <w:b/>
-          <w:bCs/>
-          <w:color w:val="auto"/>
-          <w:spacing w:val="-3"/>
-          <w:kern w:val="4"/>
-          <w:sz w:val="21"/>
-          <w:szCs w:val="21"/>
-          <w:lang w:val="en-US" w:eastAsia="zh-CN"/>
-        </w:rPr>
-        <w:t>省三等奖</w:t>
-      </w:r>
-      <w:r>
-        <w:rPr>
-          <w:rFonts w:hint="eastAsia" w:ascii="楷体" w:hAnsi="楷体" w:eastAsia="楷体" w:cs="楷体"/>
-          <w:b/>
-          <w:bCs/>
-          <w:color w:val="auto"/>
-          <w:spacing w:val="-3"/>
-          <w:kern w:val="4"/>
-          <w:sz w:val="21"/>
-          <w:szCs w:val="21"/>
-          <w:lang w:val="en-US" w:eastAsia="zh-CN"/>
-        </w:rPr>
-        <w:tab/>
-      </w:r>
-      <w:r>
-        <w:rPr>
-          <w:rFonts w:hint="eastAsia" w:ascii="楷体" w:hAnsi="楷体" w:eastAsia="楷体" w:cs="楷体"/>
-          <w:b/>
-          <w:bCs/>
-          <w:color w:val="auto"/>
-          <w:spacing w:val="-3"/>
-          <w:kern w:val="4"/>
-          <w:sz w:val="21"/>
-          <w:szCs w:val="21"/>
-          <w:lang w:val="en-US" w:eastAsia="zh-CN"/>
-        </w:rPr>
-        <w:t>核心队员</w:t>
-      </w:r>
-    </w:p>
-    <w:p>
-      <w:pPr>
         <w:pStyle w:val="2"/>
         <w:keepNext w:val="0"/>
         <w:keepLines w:val="0"/>
@@ -5770,21 +5568,65 @@
           <w:szCs w:val="21"/>
           <w:lang w:val="en-US" w:eastAsia="zh-CN"/>
         </w:rPr>
-        <w:t>学业奖学金：国家奖学金</w:t>
-      </w:r>
-      <w:r>
-        <w:rPr>
-          <w:rFonts w:hint="eastAsia" w:ascii="Times New Roman" w:hAnsi="Times New Roman" w:eastAsia="楷体" w:cs="Times New Roman"/>
-          <w:b w:val="0"/>
-          <w:bCs w:val="0"/>
-          <w:color w:val="auto"/>
-          <w:spacing w:val="-3"/>
-          <w:kern w:val="4"/>
-          <w:sz w:val="21"/>
-          <w:szCs w:val="21"/>
-          <w:lang w:val="en-US" w:eastAsia="zh-CN" w:bidi="ar-SA"/>
-        </w:rPr>
-        <w:t>（2023-2024）</w:t>
+        <w:t>学业奖学金：</w:t>
+      </w:r>
+      <w:r>
+        <w:rPr>
+          <w:rFonts w:hint="eastAsia" w:ascii="楷体" w:hAnsi="楷体" w:eastAsia="楷体" w:cs="楷体"/>
+          <w:b/>
+          <w:bCs/>
+          <w:color w:val="auto"/>
+          <w:spacing w:val="-3"/>
+          <w:kern w:val="4"/>
+          <w:sz w:val="21"/>
+          <w:szCs w:val="21"/>
+          <w:lang w:val="en-US" w:eastAsia="zh-CN"/>
+        </w:rPr>
+        <w:t>国家奖学金</w:t>
+      </w:r>
+      <m:oMath>
+        <m:r>
+          <m:rPr>
+            <m:sty m:val="p"/>
+          </m:rPr>
+          <w:rPr>
+            <w:rFonts w:ascii="Cambria Math" w:hAnsi="Cambria Math" w:cs="楷体"/>
+            <w:color w:val="auto"/>
+            <w:spacing w:val="-3"/>
+            <w:kern w:val="4"/>
+            <w:sz w:val="21"/>
+            <w:szCs w:val="21"/>
+            <w:lang w:val="en-US"/>
+          </w:rPr>
+          <m:t>×</m:t>
+        </m:r>
+      </m:oMath>
+      <w:r>
+        <w:rPr>
+          <w:rFonts w:hint="eastAsia" w:ascii="Times New Roman" w:hAnsi="Times New Roman" w:eastAsia="楷体" w:cs="Times New Roman"/>
+          <w:b/>
+          <w:bCs/>
+          <w:color w:val="auto"/>
+          <w:w w:val="105"/>
+          <w:sz w:val="21"/>
+          <w:szCs w:val="21"/>
+          <w:lang w:val="en-US" w:eastAsia="zh-CN"/>
+        </w:rPr>
+        <w:t>2</w:t>
+      </w:r>
+      <w:r>
+        <w:rPr>
+          <w:rFonts w:hint="eastAsia" w:ascii="Times New Roman" w:hAnsi="Times New Roman" w:eastAsia="楷体" w:cs="Times New Roman"/>
+          <w:b/>
+          <w:bCs/>
+          <w:color w:val="auto"/>
+          <w:spacing w:val="-3"/>
+          <w:kern w:val="4"/>
+          <w:sz w:val="21"/>
+          <w:szCs w:val="21"/>
+          <w:lang w:val="en-US" w:eastAsia="zh-CN" w:bidi="ar-SA"/>
+        </w:rPr>
+        <w:t>（2023-2024、2025-2026）</w:t>
       </w:r>
       <w:r>
         <w:rPr>
@@ -5795,21 +5637,21 @@
           <w:szCs w:val="21"/>
           <w:lang w:val="en-US" w:eastAsia="zh-CN"/>
         </w:rPr>
-        <w:t>、华为奖学金</w:t>
-      </w:r>
-      <w:r>
-        <w:rPr>
-          <w:rFonts w:hint="eastAsia" w:ascii="Times New Roman" w:hAnsi="Times New Roman" w:eastAsia="楷体" w:cs="Times New Roman"/>
-          <w:b w:val="0"/>
-          <w:bCs w:val="0"/>
-          <w:color w:val="auto"/>
-          <w:spacing w:val="-3"/>
-          <w:kern w:val="4"/>
-          <w:sz w:val="21"/>
-          <w:szCs w:val="21"/>
-          <w:lang w:val="en-US" w:eastAsia="zh-CN" w:bidi="ar-SA"/>
-        </w:rPr>
-        <w:t>（2024-2025）</w:t>
+        <w:t>、东北大学华为奖学金</w:t>
+      </w:r>
+      <w:r>
+        <w:rPr>
+          <w:rFonts w:hint="eastAsia" w:ascii="Times New Roman" w:hAnsi="Times New Roman" w:eastAsia="楷体" w:cs="Times New Roman"/>
+          <w:b w:val="0"/>
+          <w:bCs w:val="0"/>
+          <w:color w:val="auto"/>
+          <w:spacing w:val="-3"/>
+          <w:kern w:val="4"/>
+          <w:sz w:val="21"/>
+          <w:szCs w:val="21"/>
+          <w:lang w:val="en-US" w:eastAsia="zh-CN" w:bidi="ar-SA"/>
+        </w:rPr>
+        <w:t>（2024-2025）、东北大学燕宝奖学金（2025-2026）</w:t>
       </w:r>
       <w:r>
         <w:rPr>
@@ -5822,19 +5664,49 @@
         </w:rPr>
         <w:t>、东北大学校一等奖学金</w:t>
       </w:r>
-      <w:r>
-        <w:rPr>
-          <w:rFonts w:hint="eastAsia" w:ascii="Times New Roman" w:hAnsi="Times New Roman" w:eastAsia="楷体" w:cs="Times New Roman"/>
-          <w:b w:val="0"/>
-          <w:bCs w:val="0"/>
-          <w:color w:val="auto"/>
-          <w:spacing w:val="-3"/>
-          <w:kern w:val="4"/>
-          <w:sz w:val="21"/>
-          <w:szCs w:val="21"/>
-          <w:lang w:val="en-US" w:eastAsia="zh-CN" w:bidi="ar-SA"/>
-        </w:rPr>
-        <w:t>（2023-2024）</w:t>
+      <m:oMath>
+        <m:r>
+          <m:rPr>
+            <m:sty m:val="p"/>
+          </m:rPr>
+          <w:rPr>
+            <w:rFonts w:ascii="Cambria Math" w:hAnsi="Cambria Math" w:cs="楷体"/>
+            <w:color w:val="auto"/>
+            <w:spacing w:val="-3"/>
+            <w:kern w:val="4"/>
+            <w:sz w:val="21"/>
+            <w:szCs w:val="21"/>
+            <w:lang w:val="en-US"/>
+          </w:rPr>
+          <m:t>×</m:t>
+        </m:r>
+      </m:oMath>
+      <w:r>
+        <w:rPr>
+          <w:rFonts w:hint="eastAsia" w:ascii="Times New Roman" w:hAnsi="Times New Roman" w:eastAsia="楷体" w:cs="Times New Roman"/>
+          <w:b/>
+          <w:bCs/>
+          <w:color w:val="auto"/>
+          <w:w w:val="105"/>
+          <w:sz w:val="21"/>
+          <w:szCs w:val="21"/>
+          <w:lang w:val="en-US" w:eastAsia="zh-CN"/>
+        </w:rPr>
+        <w:t>2</w:t>
+      </w:r>
+      <w:r>
+        <w:rPr>
+          <w:rFonts w:hint="eastAsia" w:ascii="Times New Roman" w:hAnsi="Times New Roman" w:eastAsia="楷体" w:cs="Times New Roman"/>
+          <w:b w:val="0"/>
+          <w:bCs w:val="0"/>
+          <w:color w:val="auto"/>
+          <w:spacing w:val="-3"/>
+          <w:kern w:val="4"/>
+          <w:sz w:val="21"/>
+          <w:szCs w:val="21"/>
+          <w:lang w:val="en-US" w:eastAsia="zh-CN" w:bidi="ar-SA"/>
+        </w:rPr>
+        <w:t>（2023-2024、2025-2026）</w:t>
       </w:r>
       <w:r>
         <w:rPr>
@@ -5894,279 +5766,328 @@
         <w:ind w:left="102" w:leftChars="0"/>
         <w:textAlignment w:val="auto"/>
         <w:rPr>
+          <w:rFonts w:hint="eastAsia" w:ascii="楷体" w:hAnsi="楷体" w:eastAsia="楷体" w:cs="楷体"/>
+          <w:color w:val="auto"/>
+          <w:spacing w:val="-3"/>
+          <w:kern w:val="4"/>
+          <w:sz w:val="21"/>
+          <w:szCs w:val="21"/>
+          <w:lang w:val="en-US" w:eastAsia="zh-CN"/>
+        </w:rPr>
+      </w:pPr>
+      <w:r>
+        <w:rPr>
+          <w:rFonts w:hint="eastAsia" w:ascii="楷体" w:hAnsi="楷体" w:eastAsia="楷体" w:cs="楷体"/>
+          <w:b/>
+          <w:bCs/>
+          <w:color w:val="auto"/>
+          <w:spacing w:val="-3"/>
+          <w:kern w:val="4"/>
+          <w:sz w:val="21"/>
+          <w:szCs w:val="21"/>
+          <w:lang w:val="en-US" w:eastAsia="zh-CN"/>
+        </w:rPr>
+        <w:t>荣誉称号：</w:t>
+      </w:r>
+      <w:r>
+        <w:rPr>
           <w:rFonts w:hint="eastAsia" w:ascii="Times New Roman" w:hAnsi="Times New Roman" w:eastAsia="楷体"/>
-          <w:b w:val="0"/>
-          <w:bCs w:val="0"/>
-          <w:color w:val="000000" w:themeColor="text1"/>
-          <w:w w:val="105"/>
-          <w:sz w:val="21"/>
-          <w:szCs w:val="21"/>
-          <w:lang w:val="en-US" w:eastAsia="zh-CN"/>
-          <w14:textFill>
-            <w14:solidFill>
-              <w14:schemeClr w14:val="tx1"/>
-            </w14:solidFill>
-          </w14:textFill>
+          <w:color w:val="auto"/>
+          <w:w w:val="105"/>
+          <w:sz w:val="21"/>
+          <w:szCs w:val="21"/>
+          <w:lang w:val="en-US" w:eastAsia="zh-CN"/>
+        </w:rPr>
+        <w:t>东北大学优秀学生标兵</w:t>
+      </w:r>
+      <w:r>
+        <w:rPr>
+          <w:rFonts w:hint="eastAsia" w:ascii="Times New Roman" w:hAnsi="Times New Roman" w:eastAsia="楷体" w:cs="Times New Roman"/>
+          <w:b w:val="0"/>
+          <w:bCs w:val="0"/>
+          <w:color w:val="auto"/>
+          <w:spacing w:val="-3"/>
+          <w:kern w:val="4"/>
+          <w:sz w:val="21"/>
+          <w:szCs w:val="21"/>
+          <w:lang w:val="en-US" w:eastAsia="zh-CN" w:bidi="ar-SA"/>
+        </w:rPr>
+        <w:t>（2023-2024、2025-2026）</w:t>
+      </w:r>
+      <w:r>
+        <w:rPr>
+          <w:rFonts w:hint="eastAsia" w:ascii="Times New Roman" w:hAnsi="Times New Roman" w:eastAsia="楷体"/>
+          <w:color w:val="auto"/>
+          <w:w w:val="105"/>
+          <w:sz w:val="21"/>
+          <w:szCs w:val="21"/>
+          <w:lang w:val="en-US" w:eastAsia="zh-CN"/>
+        </w:rPr>
+        <w:t>、</w:t>
+      </w:r>
+      <w:bookmarkStart w:id="1" w:name="OLE_LINK5"/>
+      <w:r>
+        <w:rPr>
+          <w:rFonts w:hint="eastAsia" w:ascii="Times New Roman" w:hAnsi="Times New Roman" w:eastAsia="楷体"/>
+          <w:color w:val="auto"/>
+          <w:w w:val="105"/>
+          <w:sz w:val="21"/>
+          <w:szCs w:val="21"/>
+          <w:lang w:val="en-US" w:eastAsia="zh-CN"/>
+        </w:rPr>
+        <w:t>东北大学优秀学生</w:t>
+      </w:r>
+      <w:r>
+        <w:rPr>
+          <w:rFonts w:hint="eastAsia" w:ascii="Times New Roman" w:hAnsi="Times New Roman" w:eastAsia="楷体" w:cs="Times New Roman"/>
+          <w:b w:val="0"/>
+          <w:bCs w:val="0"/>
+          <w:color w:val="auto"/>
+          <w:spacing w:val="-3"/>
+          <w:kern w:val="4"/>
+          <w:sz w:val="21"/>
+          <w:szCs w:val="21"/>
+          <w:lang w:val="en-US" w:eastAsia="zh-CN" w:bidi="ar-SA"/>
+        </w:rPr>
+        <w:t>（2024-2025）</w:t>
+      </w:r>
+      <w:r>
+        <w:rPr>
+          <w:rFonts w:hint="eastAsia" w:ascii="Times New Roman" w:hAnsi="Times New Roman" w:eastAsia="楷体"/>
+          <w:color w:val="auto"/>
+          <w:w w:val="105"/>
+          <w:sz w:val="21"/>
+          <w:szCs w:val="21"/>
+          <w:lang w:val="en-US" w:eastAsia="zh-CN"/>
+        </w:rPr>
+        <w:t>；</w:t>
+      </w:r>
+      <w:r>
+        <w:rPr>
+          <w:rFonts w:hint="eastAsia" w:ascii="楷体" w:hAnsi="楷体" w:eastAsia="楷体" w:cs="楷体"/>
+          <w:color w:val="auto"/>
+          <w:spacing w:val="-3"/>
+          <w:kern w:val="4"/>
+          <w:sz w:val="21"/>
+          <w:szCs w:val="21"/>
+          <w:lang w:val="en-US" w:eastAsia="zh-CN"/>
+        </w:rPr>
+        <w:t>大学期间长期担任通信工程</w:t>
+      </w:r>
+      <w:r>
+        <w:rPr>
+          <w:rFonts w:hint="eastAsia" w:ascii="Times New Roman" w:hAnsi="Times New Roman" w:eastAsia="楷体" w:cs="Times New Roman"/>
+          <w:b w:val="0"/>
+          <w:bCs w:val="0"/>
+          <w:color w:val="auto"/>
+          <w:spacing w:val="-3"/>
+          <w:kern w:val="4"/>
+          <w:sz w:val="21"/>
+          <w:szCs w:val="21"/>
+          <w:lang w:val="en-US" w:eastAsia="zh-CN" w:bidi="ar-SA"/>
+        </w:rPr>
+        <w:t>2301</w:t>
+      </w:r>
+      <w:r>
+        <w:rPr>
+          <w:rFonts w:hint="eastAsia" w:ascii="楷体" w:hAnsi="楷体" w:eastAsia="楷体" w:cs="楷体"/>
+          <w:color w:val="auto"/>
+          <w:spacing w:val="-3"/>
+          <w:kern w:val="4"/>
+          <w:sz w:val="21"/>
+          <w:szCs w:val="21"/>
+          <w:lang w:val="en-US" w:eastAsia="zh-CN"/>
+        </w:rPr>
+        <w:t>班班长，并带领班集体</w:t>
+      </w:r>
+      <w:r>
+        <w:rPr>
+          <w:rFonts w:hint="eastAsia" w:ascii="楷体" w:hAnsi="楷体" w:eastAsia="楷体" w:cs="楷体"/>
+          <w:b/>
+          <w:bCs/>
+          <w:color w:val="auto"/>
+          <w:spacing w:val="-3"/>
+          <w:kern w:val="4"/>
+          <w:sz w:val="21"/>
+          <w:szCs w:val="21"/>
+          <w:lang w:val="en-US" w:eastAsia="zh-CN"/>
+        </w:rPr>
+        <w:t>连续两年度</w:t>
+      </w:r>
+      <w:r>
+        <w:rPr>
+          <w:rFonts w:hint="eastAsia" w:ascii="Times New Roman" w:hAnsi="Times New Roman" w:eastAsia="楷体" w:cs="Times New Roman"/>
+          <w:b w:val="0"/>
+          <w:bCs w:val="0"/>
+          <w:color w:val="auto"/>
+          <w:spacing w:val="-3"/>
+          <w:kern w:val="4"/>
+          <w:sz w:val="21"/>
+          <w:szCs w:val="21"/>
+          <w:lang w:val="en-US" w:eastAsia="zh-CN" w:bidi="ar-SA"/>
+        </w:rPr>
+        <w:t>(23-24、24-25)</w:t>
+      </w:r>
+      <w:r>
+        <w:rPr>
+          <w:rFonts w:hint="eastAsia" w:ascii="楷体" w:hAnsi="楷体" w:eastAsia="楷体" w:cs="楷体"/>
+          <w:color w:val="auto"/>
+          <w:spacing w:val="-3"/>
+          <w:kern w:val="4"/>
+          <w:sz w:val="21"/>
+          <w:szCs w:val="21"/>
+          <w:lang w:val="en-US" w:eastAsia="zh-CN"/>
+        </w:rPr>
+        <w:t>获得</w:t>
+      </w:r>
+      <w:r>
+        <w:rPr>
+          <w:rFonts w:hint="eastAsia" w:ascii="楷体" w:hAnsi="楷体" w:eastAsia="楷体" w:cs="楷体"/>
+          <w:b/>
+          <w:bCs/>
+          <w:color w:val="auto"/>
+          <w:spacing w:val="-3"/>
+          <w:kern w:val="4"/>
+          <w:sz w:val="21"/>
+          <w:szCs w:val="21"/>
+          <w:lang w:val="en-US" w:eastAsia="zh-CN"/>
+        </w:rPr>
+        <w:t>校先进班集体</w:t>
+      </w:r>
+      <w:r>
+        <w:rPr>
+          <w:rFonts w:hint="eastAsia" w:ascii="楷体" w:hAnsi="楷体" w:eastAsia="楷体" w:cs="楷体"/>
+          <w:color w:val="auto"/>
+          <w:spacing w:val="-3"/>
+          <w:kern w:val="4"/>
+          <w:sz w:val="21"/>
+          <w:szCs w:val="21"/>
+          <w:lang w:val="en-US" w:eastAsia="zh-CN"/>
+        </w:rPr>
+        <w:t>等荣誉称号; 同时长期担任电子信息类</w:t>
+      </w:r>
+      <w:r>
+        <w:rPr>
+          <w:rFonts w:hint="eastAsia" w:ascii="Times New Roman" w:hAnsi="Times New Roman" w:eastAsia="楷体" w:cs="Times New Roman"/>
+          <w:b w:val="0"/>
+          <w:bCs w:val="0"/>
+          <w:color w:val="auto"/>
+          <w:spacing w:val="-3"/>
+          <w:kern w:val="4"/>
+          <w:sz w:val="21"/>
+          <w:szCs w:val="21"/>
+          <w:lang w:val="en-US" w:eastAsia="zh-CN" w:bidi="ar-SA"/>
+        </w:rPr>
+        <w:t>2404</w:t>
+      </w:r>
+      <w:r>
+        <w:rPr>
+          <w:rFonts w:hint="eastAsia" w:ascii="楷体" w:hAnsi="楷体" w:eastAsia="楷体" w:cs="楷体"/>
+          <w:color w:val="auto"/>
+          <w:spacing w:val="-3"/>
+          <w:kern w:val="4"/>
+          <w:sz w:val="21"/>
+          <w:szCs w:val="21"/>
+          <w:lang w:val="en-US" w:eastAsia="zh-CN"/>
+        </w:rPr>
+        <w:t>班成长发展指导员，并获得</w:t>
+      </w:r>
+      <w:r>
+        <w:rPr>
+          <w:rFonts w:hint="eastAsia" w:ascii="楷体" w:hAnsi="楷体" w:eastAsia="楷体" w:cs="楷体"/>
+          <w:b w:val="0"/>
+          <w:bCs w:val="0"/>
+          <w:color w:val="auto"/>
+          <w:spacing w:val="-3"/>
+          <w:kern w:val="4"/>
+          <w:sz w:val="21"/>
+          <w:szCs w:val="21"/>
+          <w:lang w:val="en-US" w:eastAsia="zh-CN"/>
+        </w:rPr>
+        <w:t>东北大学</w:t>
+      </w:r>
+      <w:r>
+        <w:rPr>
+          <w:rFonts w:hint="eastAsia" w:ascii="Times New Roman" w:hAnsi="Times New Roman" w:eastAsia="楷体" w:cs="Times New Roman"/>
+          <w:b/>
+          <w:bCs/>
+          <w:color w:val="auto"/>
+          <w:spacing w:val="-3"/>
+          <w:kern w:val="4"/>
+          <w:sz w:val="21"/>
+          <w:szCs w:val="21"/>
+          <w:lang w:val="en-US" w:eastAsia="zh-CN" w:bidi="ar-SA"/>
+        </w:rPr>
+        <w:t>24-25</w:t>
+      </w:r>
+      <w:r>
+        <w:rPr>
+          <w:rFonts w:hint="eastAsia" w:ascii="楷体" w:hAnsi="楷体" w:eastAsia="楷体" w:cs="楷体"/>
+          <w:b/>
+          <w:bCs/>
+          <w:color w:val="auto"/>
+          <w:spacing w:val="-3"/>
+          <w:kern w:val="4"/>
+          <w:sz w:val="21"/>
+          <w:szCs w:val="21"/>
+          <w:lang w:val="en-US" w:eastAsia="zh-CN"/>
+        </w:rPr>
+        <w:t>年度优秀成长发展指导员</w:t>
+      </w:r>
+      <w:r>
+        <w:rPr>
+          <w:rFonts w:hint="eastAsia" w:ascii="楷体" w:hAnsi="楷体" w:eastAsia="楷体" w:cs="楷体"/>
+          <w:color w:val="auto"/>
+          <w:spacing w:val="-3"/>
+          <w:kern w:val="4"/>
+          <w:sz w:val="21"/>
+          <w:szCs w:val="21"/>
+          <w:lang w:val="en-US" w:eastAsia="zh-CN"/>
+        </w:rPr>
+        <w:t>称号。</w:t>
+      </w:r>
+      <w:bookmarkEnd w:id="1"/>
+    </w:p>
+    <w:p>
+      <w:pPr>
+        <w:pStyle w:val="14"/>
+        <w:keepNext w:val="0"/>
+        <w:keepLines w:val="0"/>
+        <w:pageBreakBefore w:val="0"/>
+        <w:widowControl w:val="0"/>
+        <w:numPr>
+          <w:ilvl w:val="0"/>
+          <w:numId w:val="0"/>
+        </w:numPr>
+        <w:tabs>
+          <w:tab w:val="left" w:pos="395"/>
+          <w:tab w:val="left" w:pos="2420"/>
+          <w:tab w:val="left" w:pos="2640"/>
+          <w:tab w:val="left" w:pos="5940"/>
+          <w:tab w:val="left" w:pos="8140"/>
+          <w:tab w:val="left" w:pos="10120"/>
+        </w:tabs>
+        <w:kinsoku/>
+        <w:wordWrap/>
+        <w:overflowPunct/>
+        <w:topLinePunct w:val="0"/>
+        <w:autoSpaceDE w:val="0"/>
+        <w:autoSpaceDN w:val="0"/>
+        <w:bidi w:val="0"/>
+        <w:adjustRightInd/>
+        <w:snapToGrid/>
+        <w:spacing w:before="50" w:line="240" w:lineRule="auto"/>
+        <w:textAlignment w:val="auto"/>
+        <w:rPr>
+          <w:rFonts w:hint="eastAsia" w:ascii="楷体" w:hAnsi="楷体" w:eastAsia="楷体" w:cs="楷体"/>
+          <w:color w:val="auto"/>
+          <w:spacing w:val="-3"/>
+          <w:kern w:val="4"/>
+          <w:sz w:val="21"/>
+          <w:szCs w:val="21"/>
+          <w:lang w:val="en-US" w:eastAsia="zh-CN"/>
         </w:rPr>
       </w:pPr>
-      <w:r>
-        <w:rPr>
-          <w:rFonts w:hint="eastAsia" w:ascii="楷体" w:hAnsi="楷体" w:eastAsia="楷体" w:cs="楷体"/>
-          <w:b/>
-          <w:bCs/>
-          <w:color w:val="auto"/>
-          <w:spacing w:val="-3"/>
-          <w:kern w:val="4"/>
-          <w:sz w:val="21"/>
-          <w:szCs w:val="21"/>
-          <w:lang w:val="en-US" w:eastAsia="zh-CN"/>
-        </w:rPr>
-        <w:t>荣誉称号：</w:t>
-      </w:r>
-      <w:r>
-        <w:rPr>
-          <w:rFonts w:hint="eastAsia" w:ascii="Times New Roman" w:hAnsi="Times New Roman" w:eastAsia="楷体"/>
-          <w:color w:val="auto"/>
-          <w:w w:val="105"/>
-          <w:sz w:val="21"/>
-          <w:szCs w:val="21"/>
-          <w:lang w:val="en-US" w:eastAsia="zh-CN"/>
-        </w:rPr>
-        <w:t>东北大学优秀学生标兵</w:t>
-      </w:r>
-      <w:r>
-        <w:rPr>
-          <w:rFonts w:hint="eastAsia" w:ascii="Times New Roman" w:hAnsi="Times New Roman" w:eastAsia="楷体" w:cs="Times New Roman"/>
-          <w:b w:val="0"/>
-          <w:bCs w:val="0"/>
-          <w:color w:val="auto"/>
-          <w:spacing w:val="-3"/>
-          <w:kern w:val="4"/>
-          <w:sz w:val="21"/>
-          <w:szCs w:val="21"/>
-          <w:lang w:val="en-US" w:eastAsia="zh-CN" w:bidi="ar-SA"/>
-        </w:rPr>
-        <w:t>（2023-2024）</w:t>
-      </w:r>
-      <w:r>
-        <w:rPr>
-          <w:rFonts w:hint="eastAsia" w:ascii="Times New Roman" w:hAnsi="Times New Roman" w:eastAsia="楷体"/>
-          <w:color w:val="auto"/>
-          <w:w w:val="105"/>
-          <w:sz w:val="21"/>
-          <w:szCs w:val="21"/>
-          <w:lang w:val="en-US" w:eastAsia="zh-CN"/>
-        </w:rPr>
-        <w:t>、</w:t>
-      </w:r>
-      <w:bookmarkStart w:id="1" w:name="OLE_LINK5"/>
-      <w:r>
-        <w:rPr>
-          <w:rFonts w:hint="eastAsia" w:ascii="Times New Roman" w:hAnsi="Times New Roman" w:eastAsia="楷体"/>
-          <w:color w:val="auto"/>
-          <w:w w:val="105"/>
-          <w:sz w:val="21"/>
-          <w:szCs w:val="21"/>
-          <w:lang w:val="en-US" w:eastAsia="zh-CN"/>
-        </w:rPr>
-        <w:t>东北大学优秀学生</w:t>
-      </w:r>
-      <w:r>
-        <w:rPr>
-          <w:rFonts w:hint="eastAsia" w:ascii="Times New Roman" w:hAnsi="Times New Roman" w:eastAsia="楷体" w:cs="Times New Roman"/>
-          <w:b w:val="0"/>
-          <w:bCs w:val="0"/>
-          <w:color w:val="auto"/>
-          <w:spacing w:val="-3"/>
-          <w:kern w:val="4"/>
-          <w:sz w:val="21"/>
-          <w:szCs w:val="21"/>
-          <w:lang w:val="en-US" w:eastAsia="zh-CN" w:bidi="ar-SA"/>
-        </w:rPr>
-        <w:t>（2024-2025）</w:t>
-      </w:r>
-      <w:r>
-        <w:rPr>
-          <w:rFonts w:hint="eastAsia" w:ascii="Times New Roman" w:hAnsi="Times New Roman" w:eastAsia="楷体"/>
-          <w:color w:val="auto"/>
-          <w:w w:val="105"/>
-          <w:sz w:val="21"/>
-          <w:szCs w:val="21"/>
-          <w:lang w:val="en-US" w:eastAsia="zh-CN"/>
-        </w:rPr>
-        <w:t>；</w:t>
-      </w:r>
-      <w:r>
-        <w:rPr>
-          <w:rFonts w:hint="eastAsia" w:ascii="楷体" w:hAnsi="楷体" w:eastAsia="楷体" w:cs="楷体"/>
-          <w:color w:val="auto"/>
-          <w:spacing w:val="-3"/>
-          <w:kern w:val="4"/>
-          <w:sz w:val="21"/>
-          <w:szCs w:val="21"/>
-          <w:lang w:val="en-US" w:eastAsia="zh-CN"/>
-        </w:rPr>
-        <w:t>大学期间长期担任通信工程</w:t>
-      </w:r>
-      <w:r>
-        <w:rPr>
-          <w:rFonts w:hint="eastAsia" w:ascii="Times New Roman" w:hAnsi="Times New Roman" w:eastAsia="楷体" w:cs="Times New Roman"/>
-          <w:b w:val="0"/>
-          <w:bCs w:val="0"/>
-          <w:color w:val="auto"/>
-          <w:spacing w:val="-3"/>
-          <w:kern w:val="4"/>
-          <w:sz w:val="21"/>
-          <w:szCs w:val="21"/>
-          <w:lang w:val="en-US" w:eastAsia="zh-CN" w:bidi="ar-SA"/>
-        </w:rPr>
-        <w:t>2301</w:t>
-      </w:r>
-      <w:r>
-        <w:rPr>
-          <w:rFonts w:hint="eastAsia" w:ascii="楷体" w:hAnsi="楷体" w:eastAsia="楷体" w:cs="楷体"/>
-          <w:color w:val="auto"/>
-          <w:spacing w:val="-3"/>
-          <w:kern w:val="4"/>
-          <w:sz w:val="21"/>
-          <w:szCs w:val="21"/>
-          <w:lang w:val="en-US" w:eastAsia="zh-CN"/>
-        </w:rPr>
-        <w:t>班班长，并带领班集体</w:t>
-      </w:r>
-      <w:r>
-        <w:rPr>
-          <w:rFonts w:hint="eastAsia" w:ascii="楷体" w:hAnsi="楷体" w:eastAsia="楷体" w:cs="楷体"/>
-          <w:b/>
-          <w:bCs/>
-          <w:color w:val="auto"/>
-          <w:spacing w:val="-3"/>
-          <w:kern w:val="4"/>
-          <w:sz w:val="21"/>
-          <w:szCs w:val="21"/>
-          <w:lang w:val="en-US" w:eastAsia="zh-CN"/>
-        </w:rPr>
-        <w:t>连续两年度</w:t>
-      </w:r>
-      <w:r>
-        <w:rPr>
-          <w:rFonts w:hint="eastAsia" w:ascii="Times New Roman" w:hAnsi="Times New Roman" w:eastAsia="楷体" w:cs="Times New Roman"/>
-          <w:b w:val="0"/>
-          <w:bCs w:val="0"/>
-          <w:color w:val="auto"/>
-          <w:spacing w:val="-3"/>
-          <w:kern w:val="4"/>
-          <w:sz w:val="21"/>
-          <w:szCs w:val="21"/>
-          <w:lang w:val="en-US" w:eastAsia="zh-CN" w:bidi="ar-SA"/>
-        </w:rPr>
-        <w:t>(23-24、24-25)</w:t>
-      </w:r>
-      <w:r>
-        <w:rPr>
-          <w:rFonts w:hint="eastAsia" w:ascii="楷体" w:hAnsi="楷体" w:eastAsia="楷体" w:cs="楷体"/>
-          <w:color w:val="auto"/>
-          <w:spacing w:val="-3"/>
-          <w:kern w:val="4"/>
-          <w:sz w:val="21"/>
-          <w:szCs w:val="21"/>
-          <w:lang w:val="en-US" w:eastAsia="zh-CN"/>
-        </w:rPr>
-        <w:t>获得</w:t>
-      </w:r>
-      <w:r>
-        <w:rPr>
-          <w:rFonts w:hint="eastAsia" w:ascii="楷体" w:hAnsi="楷体" w:eastAsia="楷体" w:cs="楷体"/>
-          <w:b/>
-          <w:bCs/>
-          <w:color w:val="auto"/>
-          <w:spacing w:val="-3"/>
-          <w:kern w:val="4"/>
-          <w:sz w:val="21"/>
-          <w:szCs w:val="21"/>
-          <w:lang w:val="en-US" w:eastAsia="zh-CN"/>
-        </w:rPr>
-        <w:t>校先进班集体</w:t>
-      </w:r>
-      <w:r>
-        <w:rPr>
-          <w:rFonts w:hint="eastAsia" w:ascii="楷体" w:hAnsi="楷体" w:eastAsia="楷体" w:cs="楷体"/>
-          <w:color w:val="auto"/>
-          <w:spacing w:val="-3"/>
-          <w:kern w:val="4"/>
-          <w:sz w:val="21"/>
-          <w:szCs w:val="21"/>
-          <w:lang w:val="en-US" w:eastAsia="zh-CN"/>
-        </w:rPr>
-        <w:t>等荣誉称号; 同时长期担任电子信息类</w:t>
-      </w:r>
-      <w:r>
-        <w:rPr>
-          <w:rFonts w:hint="eastAsia" w:ascii="Times New Roman" w:hAnsi="Times New Roman" w:eastAsia="楷体" w:cs="Times New Roman"/>
-          <w:b w:val="0"/>
-          <w:bCs w:val="0"/>
-          <w:color w:val="auto"/>
-          <w:spacing w:val="-3"/>
-          <w:kern w:val="4"/>
-          <w:sz w:val="21"/>
-          <w:szCs w:val="21"/>
-          <w:lang w:val="en-US" w:eastAsia="zh-CN" w:bidi="ar-SA"/>
-        </w:rPr>
-        <w:t>2404</w:t>
-      </w:r>
-      <w:r>
-        <w:rPr>
-          <w:rFonts w:hint="eastAsia" w:ascii="楷体" w:hAnsi="楷体" w:eastAsia="楷体" w:cs="楷体"/>
-          <w:color w:val="auto"/>
-          <w:spacing w:val="-3"/>
-          <w:kern w:val="4"/>
-          <w:sz w:val="21"/>
-          <w:szCs w:val="21"/>
-          <w:lang w:val="en-US" w:eastAsia="zh-CN"/>
-        </w:rPr>
-        <w:t>班成长发展指导员，并获得</w:t>
-      </w:r>
-      <w:r>
-        <w:rPr>
-          <w:rFonts w:hint="eastAsia" w:ascii="楷体" w:hAnsi="楷体" w:eastAsia="楷体" w:cs="楷体"/>
-          <w:b w:val="0"/>
-          <w:bCs w:val="0"/>
-          <w:color w:val="auto"/>
-          <w:spacing w:val="-3"/>
-          <w:kern w:val="4"/>
-          <w:sz w:val="21"/>
-          <w:szCs w:val="21"/>
-          <w:lang w:val="en-US" w:eastAsia="zh-CN"/>
-        </w:rPr>
-        <w:t>东北大学</w:t>
-      </w:r>
-      <w:r>
-        <w:rPr>
-          <w:rFonts w:hint="eastAsia" w:ascii="楷体" w:hAnsi="楷体" w:eastAsia="楷体" w:cs="楷体"/>
-          <w:b/>
-          <w:bCs/>
-          <w:color w:val="auto"/>
-          <w:spacing w:val="-3"/>
-          <w:kern w:val="4"/>
-          <w:sz w:val="21"/>
-          <w:szCs w:val="21"/>
-          <w:lang w:val="en-US" w:eastAsia="zh-CN"/>
-        </w:rPr>
-        <w:t>24-25年度优秀成长发展指导员</w:t>
-      </w:r>
-      <w:r>
-        <w:rPr>
-          <w:rFonts w:hint="eastAsia" w:ascii="楷体" w:hAnsi="楷体" w:eastAsia="楷体" w:cs="楷体"/>
-          <w:color w:val="auto"/>
-          <w:spacing w:val="-3"/>
-          <w:kern w:val="4"/>
-          <w:sz w:val="21"/>
-          <w:szCs w:val="21"/>
-          <w:lang w:val="en-US" w:eastAsia="zh-CN"/>
-        </w:rPr>
-        <w:t>称号。</w:t>
-      </w:r>
-      <w:bookmarkEnd w:id="1"/>
     </w:p>
     <w:sectPr>
       <w:type w:val="continuous"/>

</xml_diff>